<commit_message>
Update literature survey with verified recent research and add worked investigation
- Replace the survey with 16 peer-reviewed papers (2018-2024) covering OSINT,
  graph analytics and knowledge graphs, social-network analysis, geographic
  visualization and geolocation, cyber dashboards, threat-feed quality and
  misleading visualization; every reference checked against its DOI record
- Separate methodology and dataset columns in the comparison table
- Rewrite the comparison of approaches and the research gaps against the new survey
- Add Section 5.1, an end-to-end investigation showing how the views and
  safeguards support each other
- Add the Louvain algorithm to the tool references
</commit_message>
<xml_diff>
--- a/docs/OSINT_Visualization_Platform_Report.docx
+++ b/docs/OSINT_Visualization_Platform_Report.docx
@@ -311,6 +311,19 @@
       </w:pPr>
       <w:r>
         <w:rPr>
+          <w:b w:val="0"/>
+          <w:i w:val="0"/>
+          <w:sz w:val="22"/>
+        </w:rPr>
+        <w:t xml:space="preserve">      5.1 Worked investigation: how the views support each other</w:t>
+      </w:r>
+    </w:p>
+    <w:p>
+      <w:pPr>
+        <w:spacing w:after="60"/>
+      </w:pPr>
+      <w:r>
+        <w:rPr>
           <w:b/>
           <w:i w:val="0"/>
           <w:sz w:val="22"/>
@@ -457,7 +470,7 @@
           <w:b w:val="0"/>
           <w:i w:val="0"/>
         </w:rPr>
-        <w:t>Open threat-intelligence feeds publish thousands of malicious indicators every day, but as flat lists. The intelligence an analyst needs is in the relationships the lists do not show: shared servers, campaign time spans, and concentrations of infrastructure. This project designs and implements a visualization-based OSINT analytics platform. It collected 3 public feeds (URLhaus, ThreatFox, OpenPhish) and enriched them with DNS, IP geolocation, an independent ASN registry service and RIR address statistics. From these it built a provenance-labelled knowledge graph of 50,391 entities and 145,463 relationships. It then compared four visualization families (graphs, link charts, timelines and heat maps), assigning each the investigative questions it answers best. Each view carries safeguards against misinterpretation. The safeguards were tested quantitatively. Without hub suppression, multi-tenant platforms such as raw.githubusercontent.com merge unrelated indicators into a false 'campaign' of 13,580 entities; with suppression the largest cluster is 368. Normalising hosting countries by allocated IPv4 space keeps only 3 of the raw top-10 countries (Spearman ρ = 0.362). Geolocation was cross-validated against registry data (76.0% country agreement, 98.7% ASN agreement). A literature survey of 15 papers identifies the research gaps the architecture addresses.</w:t>
+        <w:t>Open threat-intelligence feeds publish thousands of malicious indicators every day, but as flat lists. The intelligence an analyst needs is in the relationships the lists do not show: shared servers, campaign time spans, and concentrations of infrastructure. This project designs and implements a visualization-based OSINT analytics platform. It collected 3 public feeds (URLhaus, ThreatFox, OpenPhish) and enriched them with DNS, IP geolocation, an independent ASN registry service and RIR address statistics. From these it built a provenance-labelled knowledge graph of 50,391 entities and 145,463 relationships. It then compared four visualization families (graphs, link charts, timelines and heat maps), assigning each the investigative questions it answers best. Each view carries safeguards against misinterpretation. The safeguards were tested quantitatively. Without hub suppression, multi-tenant platforms such as raw.githubusercontent.com merge unrelated indicators into a false 'campaign' of 13,580 entities; with suppression the largest cluster is 368. Normalising hosting countries by allocated IPv4 space keeps only 3 of the raw top-10 countries (Spearman ρ = 0.362). Geolocation was cross-validated against registry data (76.0% country agreement, 98.7% ASN agreement). A literature survey of 16 recent papers identifies the research gaps the architecture addresses.</w:t>
       </w:r>
     </w:p>
     <w:p>
@@ -922,7 +935,7 @@
               <w:rPr>
                 <w:sz w:val="18"/>
               </w:rPr>
-              <w:t>15-paper comparison (Section 2)</w:t>
+              <w:t>16-paper comparison (Section 2)</w:t>
             </w:r>
           </w:p>
         </w:tc>
@@ -1442,7 +1455,7 @@
           <w:b w:val="0"/>
           <w:i w:val="0"/>
         </w:rPr>
-        <w:t>Fifteen papers were reviewed across five areas required by the brief: OSINT and intelligence analysis, graph visualization and analytics, social-network analysis, geographic visualization, and cyber-intelligence visualization and dashboards. Table 3 compares their approach, methodology, data, findings and limitations. Section 2.2 derives the research gaps that the proposed architecture addresses.</w:t>
+        <w:t>Sixteen peer-reviewed papers, mostly from 2020–2024, were reviewed across the five areas required by the brief: OSINT and threat intelligence, graph analytics and knowledge graphs, social-network analysis, geographic visualization and geolocation, and cyber-intelligence visualization and dashboards. Two further papers on misleading visualization and timeline design were added, because the brief asks how to reduce misinterpretation. Every reference was checked against its publisher or DOI record. Table 3 compares the visualization or analytical approach, methodology, dataset, findings and limitations of each paper. Section 2.2 derives the research gaps that the proposed architecture addresses.</w:t>
       </w:r>
     </w:p>
     <w:p>
@@ -1466,16 +1479,113 @@
         <w:tblLook w:firstColumn="1" w:firstRow="1" w:lastColumn="0" w:lastRow="0" w:noHBand="0" w:noVBand="1" w:val="04A0"/>
       </w:tblPr>
       <w:tblGrid>
-        <w:gridCol w:w="1624"/>
-        <w:gridCol w:w="1624"/>
-        <w:gridCol w:w="1624"/>
-        <w:gridCol w:w="1624"/>
-        <w:gridCol w:w="1624"/>
-        <w:gridCol w:w="1624"/>
+        <w:gridCol w:w="1392"/>
+        <w:gridCol w:w="1392"/>
+        <w:gridCol w:w="1392"/>
+        <w:gridCol w:w="1392"/>
+        <w:gridCol w:w="1392"/>
+        <w:gridCol w:w="1392"/>
+        <w:gridCol w:w="1392"/>
       </w:tblGrid>
       <w:tr>
         <w:tc>
           <w:tcPr>
+            <w:tcW w:type="dxa" w:w="1417"/>
+            <w:shd w:val="clear" w:color="auto" w:fill="D9E2F3"/>
+          </w:tcPr>
+          <w:p>
+            <w:r/>
+            <w:r>
+              <w:rPr>
+                <w:b/>
+                <w:sz w:val="14"/>
+              </w:rPr>
+              <w:t>Paper</w:t>
+            </w:r>
+          </w:p>
+        </w:tc>
+        <w:tc>
+          <w:tcPr>
+            <w:tcW w:type="dxa" w:w="964"/>
+            <w:shd w:val="clear" w:color="auto" w:fill="D9E2F3"/>
+          </w:tcPr>
+          <w:p>
+            <w:r/>
+            <w:r>
+              <w:rPr>
+                <w:b/>
+                <w:sz w:val="14"/>
+              </w:rPr>
+              <w:t>Area</w:t>
+            </w:r>
+          </w:p>
+        </w:tc>
+        <w:tc>
+          <w:tcPr>
+            <w:tcW w:type="dxa" w:w="1587"/>
+            <w:shd w:val="clear" w:color="auto" w:fill="D9E2F3"/>
+          </w:tcPr>
+          <w:p>
+            <w:r/>
+            <w:r>
+              <w:rPr>
+                <w:b/>
+                <w:sz w:val="14"/>
+              </w:rPr>
+              <w:t>Approach / visualization</w:t>
+            </w:r>
+          </w:p>
+        </w:tc>
+        <w:tc>
+          <w:tcPr>
+            <w:tcW w:type="dxa" w:w="1247"/>
+            <w:shd w:val="clear" w:color="auto" w:fill="D9E2F3"/>
+          </w:tcPr>
+          <w:p>
+            <w:r/>
+            <w:r>
+              <w:rPr>
+                <w:b/>
+                <w:sz w:val="14"/>
+              </w:rPr>
+              <w:t>Methodology</w:t>
+            </w:r>
+          </w:p>
+        </w:tc>
+        <w:tc>
+          <w:tcPr>
+            <w:tcW w:type="dxa" w:w="1247"/>
+            <w:shd w:val="clear" w:color="auto" w:fill="D9E2F3"/>
+          </w:tcPr>
+          <w:p>
+            <w:r/>
+            <w:r>
+              <w:rPr>
+                <w:b/>
+                <w:sz w:val="14"/>
+              </w:rPr>
+              <w:t>Dataset</w:t>
+            </w:r>
+          </w:p>
+        </w:tc>
+        <w:tc>
+          <w:tcPr>
+            <w:tcW w:type="dxa" w:w="1701"/>
+            <w:shd w:val="clear" w:color="auto" w:fill="D9E2F3"/>
+          </w:tcPr>
+          <w:p>
+            <w:r/>
+            <w:r>
+              <w:rPr>
+                <w:b/>
+                <w:sz w:val="14"/>
+              </w:rPr>
+              <w:t>Key findings</w:t>
+            </w:r>
+          </w:p>
+        </w:tc>
+        <w:tc>
+          <w:tcPr>
             <w:tcW w:type="dxa" w:w="1474"/>
             <w:shd w:val="clear" w:color="auto" w:fill="D9E2F3"/>
           </w:tcPr>
@@ -1484,87 +1594,7 @@
             <w:r>
               <w:rPr>
                 <w:b/>
-                <w:sz w:val="15"/>
-              </w:rPr>
-              <w:t>Paper</w:t>
-            </w:r>
-          </w:p>
-        </w:tc>
-        <w:tc>
-          <w:tcPr>
-            <w:tcW w:type="dxa" w:w="1134"/>
-            <w:shd w:val="clear" w:color="auto" w:fill="D9E2F3"/>
-          </w:tcPr>
-          <w:p>
-            <w:r/>
-            <w:r>
-              <w:rPr>
-                <w:b/>
-                <w:sz w:val="15"/>
-              </w:rPr>
-              <w:t>Area</w:t>
-            </w:r>
-          </w:p>
-        </w:tc>
-        <w:tc>
-          <w:tcPr>
-            <w:tcW w:type="dxa" w:w="1928"/>
-            <w:shd w:val="clear" w:color="auto" w:fill="D9E2F3"/>
-          </w:tcPr>
-          <w:p>
-            <w:r/>
-            <w:r>
-              <w:rPr>
-                <w:b/>
-                <w:sz w:val="15"/>
-              </w:rPr>
-              <w:t>Approach / visualization</w:t>
-            </w:r>
-          </w:p>
-        </w:tc>
-        <w:tc>
-          <w:tcPr>
-            <w:tcW w:type="dxa" w:w="1814"/>
-            <w:shd w:val="clear" w:color="auto" w:fill="D9E2F3"/>
-          </w:tcPr>
-          <w:p>
-            <w:r/>
-            <w:r>
-              <w:rPr>
-                <w:b/>
-                <w:sz w:val="15"/>
-              </w:rPr>
-              <w:t>Methodology &amp; dataset</w:t>
-            </w:r>
-          </w:p>
-        </w:tc>
-        <w:tc>
-          <w:tcPr>
-            <w:tcW w:type="dxa" w:w="1814"/>
-            <w:shd w:val="clear" w:color="auto" w:fill="D9E2F3"/>
-          </w:tcPr>
-          <w:p>
-            <w:r/>
-            <w:r>
-              <w:rPr>
-                <w:b/>
-                <w:sz w:val="15"/>
-              </w:rPr>
-              <w:t>Key findings</w:t>
-            </w:r>
-          </w:p>
-        </w:tc>
-        <w:tc>
-          <w:tcPr>
-            <w:tcW w:type="dxa" w:w="1474"/>
-            <w:shd w:val="clear" w:color="auto" w:fill="D9E2F3"/>
-          </w:tcPr>
-          <w:p>
-            <w:r/>
-            <w:r>
-              <w:rPr>
-                <w:b/>
-                <w:sz w:val="15"/>
+                <w:sz w:val="14"/>
               </w:rPr>
               <w:t>Limitations</w:t>
             </w:r>
@@ -1574,85 +1604,99 @@
       <w:tr>
         <w:tc>
           <w:tcPr>
+            <w:tcW w:type="dxa" w:w="1417"/>
+          </w:tcPr>
+          <w:p>
+            <w:r/>
+            <w:r>
+              <w:rPr>
+                <w:sz w:val="14"/>
+              </w:rPr>
+              <w:t>[L1] Yadav, Kumar &amp; Singh (2023)</w:t>
+            </w:r>
+          </w:p>
+        </w:tc>
+        <w:tc>
+          <w:tcPr>
+            <w:tcW w:type="dxa" w:w="964"/>
+          </w:tcPr>
+          <w:p>
+            <w:r/>
+            <w:r>
+              <w:rPr>
+                <w:sz w:val="14"/>
+              </w:rPr>
+              <w:t>OSINT review</w:t>
+            </w:r>
+          </w:p>
+        </w:tc>
+        <w:tc>
+          <w:tcPr>
+            <w:tcW w:type="dxa" w:w="1587"/>
+          </w:tcPr>
+          <w:p>
+            <w:r/>
+            <w:r>
+              <w:rPr>
+                <w:sz w:val="14"/>
+              </w:rPr>
+              <w:t>Survey of OSINT tools, techniques and cyber-security applications</w:t>
+            </w:r>
+          </w:p>
+        </w:tc>
+        <w:tc>
+          <w:tcPr>
+            <w:tcW w:type="dxa" w:w="1247"/>
+          </w:tcPr>
+          <w:p>
+            <w:r/>
+            <w:r>
+              <w:rPr>
+                <w:sz w:val="14"/>
+              </w:rPr>
+              <w:t>Literature review</w:t>
+            </w:r>
+          </w:p>
+        </w:tc>
+        <w:tc>
+          <w:tcPr>
+            <w:tcW w:type="dxa" w:w="1247"/>
+          </w:tcPr>
+          <w:p>
+            <w:r/>
+            <w:r>
+              <w:rPr>
+                <w:sz w:val="14"/>
+              </w:rPr>
+              <w:t>Published OSINT studies and tools</w:t>
+            </w:r>
+          </w:p>
+        </w:tc>
+        <w:tc>
+          <w:tcPr>
+            <w:tcW w:type="dxa" w:w="1701"/>
+          </w:tcPr>
+          <w:p>
+            <w:r/>
+            <w:r>
+              <w:rPr>
+                <w:sz w:val="14"/>
+              </w:rPr>
+              <w:t>OSINT is used widely in cybercrime, forensics and social-network security; automation with ML/AI is the main trend</w:t>
+            </w:r>
+          </w:p>
+        </w:tc>
+        <w:tc>
+          <w:tcPr>
             <w:tcW w:type="dxa" w:w="1474"/>
           </w:tcPr>
           <w:p>
             <w:r/>
             <w:r>
               <w:rPr>
-                <w:sz w:val="15"/>
-              </w:rPr>
-              <w:t>[L1] Pirolli &amp; Card (2005)</w:t>
-            </w:r>
-          </w:p>
-        </w:tc>
-        <w:tc>
-          <w:tcPr>
-            <w:tcW w:type="dxa" w:w="1134"/>
-          </w:tcPr>
-          <w:p>
-            <w:r/>
-            <w:r>
-              <w:rPr>
-                <w:sz w:val="15"/>
-              </w:rPr>
-              <w:t>Intelligence analysis</w:t>
-            </w:r>
-          </w:p>
-        </w:tc>
-        <w:tc>
-          <w:tcPr>
-            <w:tcW w:type="dxa" w:w="1928"/>
-          </w:tcPr>
-          <w:p>
-            <w:r/>
-            <w:r>
-              <w:rPr>
-                <w:sz w:val="15"/>
-              </w:rPr>
-              <w:t>Cognitive task analysis of intelligence analysts; sensemaking loop (foraging → schema → hypothesis → presentation)</w:t>
-            </w:r>
-          </w:p>
-        </w:tc>
-        <w:tc>
-          <w:tcPr>
-            <w:tcW w:type="dxa" w:w="1814"/>
-          </w:tcPr>
-          <w:p>
-            <w:r/>
-            <w:r>
-              <w:rPr>
-                <w:sz w:val="15"/>
-              </w:rPr>
-              <w:t>Interviews and think-aloud with analysts</w:t>
-            </w:r>
-          </w:p>
-        </w:tc>
-        <w:tc>
-          <w:tcPr>
-            <w:tcW w:type="dxa" w:w="1814"/>
-          </w:tcPr>
-          <w:p>
-            <w:r/>
-            <w:r>
-              <w:rPr>
-                <w:sz w:val="15"/>
-              </w:rPr>
-              <w:t>Analysts spend most effort on foraging and on keeping track of evidence; leverage points for tools identified</w:t>
-            </w:r>
-          </w:p>
-        </w:tc>
-        <w:tc>
-          <w:tcPr>
-            <w:tcW w:type="dxa" w:w="1474"/>
-          </w:tcPr>
-          <w:p>
-            <w:r/>
-            <w:r>
-              <w:rPr>
-                <w:sz w:val="15"/>
-              </w:rPr>
-              <w:t>Conceptual; no implemented system or quantitative evaluation</w:t>
+                <w:sz w:val="14"/>
+              </w:rPr>
+              <w:t>Visualization and evidence presentation get little attention; no evaluation framework</w:t>
             </w:r>
           </w:p>
         </w:tc>
@@ -1660,85 +1704,99 @@
       <w:tr>
         <w:tc>
           <w:tcPr>
+            <w:tcW w:type="dxa" w:w="1417"/>
+          </w:tcPr>
+          <w:p>
+            <w:r/>
+            <w:r>
+              <w:rPr>
+                <w:sz w:val="14"/>
+              </w:rPr>
+              <w:t>[L2] Browne, Abedin &amp; Chowdhury (2024)</w:t>
+            </w:r>
+          </w:p>
+        </w:tc>
+        <w:tc>
+          <w:tcPr>
+            <w:tcW w:type="dxa" w:w="964"/>
+          </w:tcPr>
+          <w:p>
+            <w:r/>
+            <w:r>
+              <w:rPr>
+                <w:sz w:val="14"/>
+              </w:rPr>
+              <w:t>OSINT + AI</w:t>
+            </w:r>
+          </w:p>
+        </w:tc>
+        <w:tc>
+          <w:tcPr>
+            <w:tcW w:type="dxa" w:w="1587"/>
+          </w:tcPr>
+          <w:p>
+            <w:r/>
+            <w:r>
+              <w:rPr>
+                <w:sz w:val="14"/>
+              </w:rPr>
+              <w:t>Systematic review of AI applied to OSINT</w:t>
+            </w:r>
+          </w:p>
+        </w:tc>
+        <w:tc>
+          <w:tcPr>
+            <w:tcW w:type="dxa" w:w="1247"/>
+          </w:tcPr>
+          <w:p>
+            <w:r/>
+            <w:r>
+              <w:rPr>
+                <w:sz w:val="14"/>
+              </w:rPr>
+              <w:t>PRISMA systematic review</w:t>
+            </w:r>
+          </w:p>
+        </w:tc>
+        <w:tc>
+          <w:tcPr>
+            <w:tcW w:type="dxa" w:w="1247"/>
+          </w:tcPr>
+          <w:p>
+            <w:r/>
+            <w:r>
+              <w:rPr>
+                <w:sz w:val="14"/>
+              </w:rPr>
+              <w:t>163 research articles</w:t>
+            </w:r>
+          </w:p>
+        </w:tc>
+        <w:tc>
+          <w:tcPr>
+            <w:tcW w:type="dxa" w:w="1701"/>
+          </w:tcPr>
+          <w:p>
+            <w:r/>
+            <w:r>
+              <w:rPr>
+                <w:sz w:val="14"/>
+              </w:rPr>
+              <w:t>Most work focuses on collection and classification (NLP, ML); applications span social media, dark web and threat intelligence</w:t>
+            </w:r>
+          </w:p>
+        </w:tc>
+        <w:tc>
+          <w:tcPr>
             <w:tcW w:type="dxa" w:w="1474"/>
           </w:tcPr>
           <w:p>
             <w:r/>
             <w:r>
               <w:rPr>
-                <w:sz w:val="15"/>
-              </w:rPr>
-              <w:t>[L2] Stasko, Görg &amp; Liu (2008) Jigsaw</w:t>
-            </w:r>
-          </w:p>
-        </w:tc>
-        <w:tc>
-          <w:tcPr>
-            <w:tcW w:type="dxa" w:w="1134"/>
-          </w:tcPr>
-          <w:p>
-            <w:r/>
-            <w:r>
-              <w:rPr>
-                <w:sz w:val="15"/>
-              </w:rPr>
-              <w:t>Investigative visual analytics</w:t>
-            </w:r>
-          </w:p>
-        </w:tc>
-        <w:tc>
-          <w:tcPr>
-            <w:tcW w:type="dxa" w:w="1928"/>
-          </w:tcPr>
-          <w:p>
-            <w:r/>
-            <w:r>
-              <w:rPr>
-                <w:sz w:val="15"/>
-              </w:rPr>
-              <w:t>Entity extraction from documents + linked list, graph, calendar and scatter views</w:t>
-            </w:r>
-          </w:p>
-        </w:tc>
-        <w:tc>
-          <w:tcPr>
-            <w:tcW w:type="dxa" w:w="1814"/>
-          </w:tcPr>
-          <w:p>
-            <w:r/>
-            <w:r>
-              <w:rPr>
-                <w:sz w:val="15"/>
-              </w:rPr>
-              <w:t>System design; user study with analysts on a fictional intelligence case</w:t>
-            </w:r>
-          </w:p>
-        </w:tc>
-        <w:tc>
-          <w:tcPr>
-            <w:tcW w:type="dxa" w:w="1814"/>
-          </w:tcPr>
-          <w:p>
-            <w:r/>
-            <w:r>
-              <w:rPr>
-                <w:sz w:val="15"/>
-              </w:rPr>
-              <w:t>Multiple coordinated views of entity connections help analysts find plots faster</w:t>
-            </w:r>
-          </w:p>
-        </w:tc>
-        <w:tc>
-          <w:tcPr>
-            <w:tcW w:type="dxa" w:w="1474"/>
-          </w:tcPr>
-          <w:p>
-            <w:r/>
-            <w:r>
-              <w:rPr>
-                <w:sz w:val="15"/>
-              </w:rPr>
-              <w:t>Text documents only; entity extraction errors propagate; small user study</w:t>
+                <w:sz w:val="14"/>
+              </w:rPr>
+              <w:t>Few studies address explainability or how results are shown to analysts</w:t>
             </w:r>
           </w:p>
         </w:tc>
@@ -1746,85 +1804,99 @@
       <w:tr>
         <w:tc>
           <w:tcPr>
+            <w:tcW w:type="dxa" w:w="1417"/>
+          </w:tcPr>
+          <w:p>
+            <w:r/>
+            <w:r>
+              <w:rPr>
+                <w:sz w:val="14"/>
+              </w:rPr>
+              <w:t>[L3] Riebe, Biselli, Kaufhold &amp; Reuter (2023)</w:t>
+            </w:r>
+          </w:p>
+        </w:tc>
+        <w:tc>
+          <w:tcPr>
+            <w:tcW w:type="dxa" w:w="964"/>
+          </w:tcPr>
+          <w:p>
+            <w:r/>
+            <w:r>
+              <w:rPr>
+                <w:sz w:val="14"/>
+              </w:rPr>
+              <w:t>OSINT ethics / privacy</w:t>
+            </w:r>
+          </w:p>
+        </w:tc>
+        <w:tc>
+          <w:tcPr>
+            <w:tcW w:type="dxa" w:w="1587"/>
+          </w:tcPr>
+          <w:p>
+            <w:r/>
+            <w:r>
+              <w:rPr>
+                <w:sz w:val="14"/>
+              </w:rPr>
+              <w:t>Acceptance and privacy concerns of OSINT for cyber security</w:t>
+            </w:r>
+          </w:p>
+        </w:tc>
+        <w:tc>
+          <w:tcPr>
+            <w:tcW w:type="dxa" w:w="1247"/>
+          </w:tcPr>
+          <w:p>
+            <w:r/>
+            <w:r>
+              <w:rPr>
+                <w:sz w:val="14"/>
+              </w:rPr>
+              <w:t>Representative population survey</w:t>
+            </w:r>
+          </w:p>
+        </w:tc>
+        <w:tc>
+          <w:tcPr>
+            <w:tcW w:type="dxa" w:w="1247"/>
+          </w:tcPr>
+          <w:p>
+            <w:r/>
+            <w:r>
+              <w:rPr>
+                <w:sz w:val="14"/>
+              </w:rPr>
+              <w:t>Survey responses from the general public</w:t>
+            </w:r>
+          </w:p>
+        </w:tc>
+        <w:tc>
+          <w:tcPr>
+            <w:tcW w:type="dxa" w:w="1701"/>
+          </w:tcPr>
+          <w:p>
+            <w:r/>
+            <w:r>
+              <w:rPr>
+                <w:sz w:val="14"/>
+              </w:rPr>
+              <w:t>Acceptance depends on purpose and transparency; collection of personal data raises strong privacy concerns</w:t>
+            </w:r>
+          </w:p>
+        </w:tc>
+        <w:tc>
+          <w:tcPr>
             <w:tcW w:type="dxa" w:w="1474"/>
           </w:tcPr>
           <w:p>
             <w:r/>
             <w:r>
               <w:rPr>
-                <w:sz w:val="15"/>
-              </w:rPr>
-              <w:t>[L3] Pastor-Galindo et al. (2020)</w:t>
-            </w:r>
-          </w:p>
-        </w:tc>
-        <w:tc>
-          <w:tcPr>
-            <w:tcW w:type="dxa" w:w="1134"/>
-          </w:tcPr>
-          <w:p>
-            <w:r/>
-            <w:r>
-              <w:rPr>
-                <w:sz w:val="15"/>
-              </w:rPr>
-              <w:t>OSINT survey</w:t>
-            </w:r>
-          </w:p>
-        </w:tc>
-        <w:tc>
-          <w:tcPr>
-            <w:tcW w:type="dxa" w:w="1928"/>
-          </w:tcPr>
-          <w:p>
-            <w:r/>
-            <w:r>
-              <w:rPr>
-                <w:sz w:val="15"/>
-              </w:rPr>
-              <w:t>Survey of OSINT sources, tools, techniques and applications</w:t>
-            </w:r>
-          </w:p>
-        </w:tc>
-        <w:tc>
-          <w:tcPr>
-            <w:tcW w:type="dxa" w:w="1814"/>
-          </w:tcPr>
-          <w:p>
-            <w:r/>
-            <w:r>
-              <w:rPr>
-                <w:sz w:val="15"/>
-              </w:rPr>
-              <w:t>Systematic literature review</w:t>
-            </w:r>
-          </w:p>
-        </w:tc>
-        <w:tc>
-          <w:tcPr>
-            <w:tcW w:type="dxa" w:w="1814"/>
-          </w:tcPr>
-          <w:p>
-            <w:r/>
-            <w:r>
-              <w:rPr>
-                <w:sz w:val="15"/>
-              </w:rPr>
-              <w:t>OSINT is under-exploited; integration of sources and analysis is the main challenge</w:t>
-            </w:r>
-          </w:p>
-        </w:tc>
-        <w:tc>
-          <w:tcPr>
-            <w:tcW w:type="dxa" w:w="1474"/>
-          </w:tcPr>
-          <w:p>
-            <w:r/>
-            <w:r>
-              <w:rPr>
-                <w:sz w:val="15"/>
-              </w:rPr>
-              <w:t>No implementation; visualization treated only briefly</w:t>
+                <w:sz w:val="14"/>
+              </w:rPr>
+              <w:t>Survey of attitudes, not of tools; single national sample</w:t>
             </w:r>
           </w:p>
         </w:tc>
@@ -1832,85 +1904,99 @@
       <w:tr>
         <w:tc>
           <w:tcPr>
+            <w:tcW w:type="dxa" w:w="1417"/>
+          </w:tcPr>
+          <w:p>
+            <w:r/>
+            <w:r>
+              <w:rPr>
+                <w:sz w:val="14"/>
+              </w:rPr>
+              <w:t>[L4] Böhm, Menges &amp; Pernul (2018)</w:t>
+            </w:r>
+          </w:p>
+        </w:tc>
+        <w:tc>
+          <w:tcPr>
+            <w:tcW w:type="dxa" w:w="964"/>
+          </w:tcPr>
+          <w:p>
+            <w:r/>
+            <w:r>
+              <w:rPr>
+                <w:sz w:val="14"/>
+              </w:rPr>
+              <w:t>CTI visual analytics</w:t>
+            </w:r>
+          </w:p>
+        </w:tc>
+        <w:tc>
+          <w:tcPr>
+            <w:tcW w:type="dxa" w:w="1587"/>
+          </w:tcPr>
+          <w:p>
+            <w:r/>
+            <w:r>
+              <w:rPr>
+                <w:sz w:val="14"/>
+              </w:rPr>
+              <w:t>Graph-based persistence and interactive graph visualization of STIX threat intelligence</w:t>
+            </w:r>
+          </w:p>
+        </w:tc>
+        <w:tc>
+          <w:tcPr>
+            <w:tcW w:type="dxa" w:w="1247"/>
+          </w:tcPr>
+          <w:p>
+            <w:r/>
+            <w:r>
+              <w:rPr>
+                <w:sz w:val="14"/>
+              </w:rPr>
+              <w:t>Prototype implementation and demonstration</w:t>
+            </w:r>
+          </w:p>
+        </w:tc>
+        <w:tc>
+          <w:tcPr>
+            <w:tcW w:type="dxa" w:w="1247"/>
+          </w:tcPr>
+          <w:p>
+            <w:r/>
+            <w:r>
+              <w:rPr>
+                <w:sz w:val="14"/>
+              </w:rPr>
+              <w:t>Example STIX 2 threat-intelligence data</w:t>
+            </w:r>
+          </w:p>
+        </w:tc>
+        <w:tc>
+          <w:tcPr>
+            <w:tcW w:type="dxa" w:w="1701"/>
+          </w:tcPr>
+          <w:p>
+            <w:r/>
+            <w:r>
+              <w:rPr>
+                <w:sz w:val="14"/>
+              </w:rPr>
+              <w:t>Graph views help analysts explore and enrich semi-structured CTI</w:t>
+            </w:r>
+          </w:p>
+        </w:tc>
+        <w:tc>
+          <w:tcPr>
             <w:tcW w:type="dxa" w:w="1474"/>
           </w:tcPr>
           <w:p>
             <w:r/>
             <w:r>
               <w:rPr>
-                <w:sz w:val="15"/>
-              </w:rPr>
-              <w:t>[L4] Böhm &amp; Lolagar (2021)</w:t>
-            </w:r>
-          </w:p>
-        </w:tc>
-        <w:tc>
-          <w:tcPr>
-            <w:tcW w:type="dxa" w:w="1134"/>
-          </w:tcPr>
-          <w:p>
-            <w:r/>
-            <w:r>
-              <w:rPr>
-                <w:sz w:val="15"/>
-              </w:rPr>
-              <w:t>OSINT ethics and law</w:t>
-            </w:r>
-          </w:p>
-        </w:tc>
-        <w:tc>
-          <w:tcPr>
-            <w:tcW w:type="dxa" w:w="1928"/>
-          </w:tcPr>
-          <w:p>
-            <w:r/>
-            <w:r>
-              <w:rPr>
-                <w:sz w:val="15"/>
-              </w:rPr>
-              <w:t>Legal and ethical framework for OSINT</w:t>
-            </w:r>
-          </w:p>
-        </w:tc>
-        <w:tc>
-          <w:tcPr>
-            <w:tcW w:type="dxa" w:w="1814"/>
-          </w:tcPr>
-          <w:p>
-            <w:r/>
-            <w:r>
-              <w:rPr>
-                <w:sz w:val="15"/>
-              </w:rPr>
-              <w:t>Legal analysis (GDPR, data protection)</w:t>
-            </w:r>
-          </w:p>
-        </w:tc>
-        <w:tc>
-          <w:tcPr>
-            <w:tcW w:type="dxa" w:w="1814"/>
-          </w:tcPr>
-          <w:p>
-            <w:r/>
-            <w:r>
-              <w:rPr>
-                <w:sz w:val="15"/>
-              </w:rPr>
-              <w:t>Public does not mean unrestricted; purpose limitation and minimisation apply</w:t>
-            </w:r>
-          </w:p>
-        </w:tc>
-        <w:tc>
-          <w:tcPr>
-            <w:tcW w:type="dxa" w:w="1474"/>
-          </w:tcPr>
-          <w:p>
-            <w:r/>
-            <w:r>
-              <w:rPr>
-                <w:sz w:val="15"/>
-              </w:rPr>
-              <w:t>European focus; no technical controls proposed</w:t>
+                <w:sz w:val="14"/>
+              </w:rPr>
+              <w:t>Relies on structured STIX input; no geographic or temporal view; small evaluation</w:t>
             </w:r>
           </w:p>
         </w:tc>
@@ -1918,85 +2004,99 @@
       <w:tr>
         <w:tc>
           <w:tcPr>
+            <w:tcW w:type="dxa" w:w="1417"/>
+          </w:tcPr>
+          <w:p>
+            <w:r/>
+            <w:r>
+              <w:rPr>
+                <w:sz w:val="14"/>
+              </w:rPr>
+              <w:t>[L5] Sarhan &amp; Spruit (2021)</w:t>
+            </w:r>
+          </w:p>
+        </w:tc>
+        <w:tc>
+          <w:tcPr>
+            <w:tcW w:type="dxa" w:w="964"/>
+          </w:tcPr>
+          <w:p>
+            <w:r/>
+            <w:r>
+              <w:rPr>
+                <w:sz w:val="14"/>
+              </w:rPr>
+              <w:t>Knowledge graphs / entity extraction</w:t>
+            </w:r>
+          </w:p>
+        </w:tc>
+        <w:tc>
+          <w:tcPr>
+            <w:tcW w:type="dxa" w:w="1587"/>
+          </w:tcPr>
+          <w:p>
+            <w:r/>
+            <w:r>
+              <w:rPr>
+                <w:sz w:val="14"/>
+              </w:rPr>
+              <w:t>Open-CyKG: open information extraction + cyber NER to build a threat-intelligence knowledge graph</w:t>
+            </w:r>
+          </w:p>
+        </w:tc>
+        <w:tc>
+          <w:tcPr>
+            <w:tcW w:type="dxa" w:w="1247"/>
+          </w:tcPr>
+          <w:p>
+            <w:r/>
+            <w:r>
+              <w:rPr>
+                <w:sz w:val="14"/>
+              </w:rPr>
+              <w:t>Neural OIE and NER, embedding-based canonicalisation</w:t>
+            </w:r>
+          </w:p>
+        </w:tc>
+        <w:tc>
+          <w:tcPr>
+            <w:tcW w:type="dxa" w:w="1247"/>
+          </w:tcPr>
+          <w:p>
+            <w:r/>
+            <w:r>
+              <w:rPr>
+                <w:sz w:val="14"/>
+              </w:rPr>
+              <w:t>APT threat reports (unstructured text)</w:t>
+            </w:r>
+          </w:p>
+        </w:tc>
+        <w:tc>
+          <w:tcPr>
+            <w:tcW w:type="dxa" w:w="1701"/>
+          </w:tcPr>
+          <w:p>
+            <w:r/>
+            <w:r>
+              <w:rPr>
+                <w:sz w:val="14"/>
+              </w:rPr>
+              <w:t>Automatically extracted triples form a queryable CTI knowledge graph; components beat baselines</w:t>
+            </w:r>
+          </w:p>
+        </w:tc>
+        <w:tc>
+          <w:tcPr>
             <w:tcW w:type="dxa" w:w="1474"/>
           </w:tcPr>
           <w:p>
             <w:r/>
             <w:r>
               <w:rPr>
-                <w:sz w:val="15"/>
-              </w:rPr>
-              <w:t>[L5] Herman, Melançon &amp; Marshall (2000)</w:t>
-            </w:r>
-          </w:p>
-        </w:tc>
-        <w:tc>
-          <w:tcPr>
-            <w:tcW w:type="dxa" w:w="1134"/>
-          </w:tcPr>
-          <w:p>
-            <w:r/>
-            <w:r>
-              <w:rPr>
-                <w:sz w:val="15"/>
-              </w:rPr>
-              <w:t>Graph visualization</w:t>
-            </w:r>
-          </w:p>
-        </w:tc>
-        <w:tc>
-          <w:tcPr>
-            <w:tcW w:type="dxa" w:w="1928"/>
-          </w:tcPr>
-          <w:p>
-            <w:r/>
-            <w:r>
-              <w:rPr>
-                <w:sz w:val="15"/>
-              </w:rPr>
-              <w:t>Survey of graph layout, navigation and clustering techniques</w:t>
-            </w:r>
-          </w:p>
-        </w:tc>
-        <w:tc>
-          <w:tcPr>
-            <w:tcW w:type="dxa" w:w="1814"/>
-          </w:tcPr>
-          <w:p>
-            <w:r/>
-            <w:r>
-              <w:rPr>
-                <w:sz w:val="15"/>
-              </w:rPr>
-              <w:t>Literature survey</w:t>
-            </w:r>
-          </w:p>
-        </w:tc>
-        <w:tc>
-          <w:tcPr>
-            <w:tcW w:type="dxa" w:w="1814"/>
-          </w:tcPr>
-          <w:p>
-            <w:r/>
-            <w:r>
-              <w:rPr>
-                <w:sz w:val="15"/>
-              </w:rPr>
-              <w:t>Large graphs need clustering, filtering and focus+context navigation</w:t>
-            </w:r>
-          </w:p>
-        </w:tc>
-        <w:tc>
-          <w:tcPr>
-            <w:tcW w:type="dxa" w:w="1474"/>
-          </w:tcPr>
-          <w:p>
-            <w:r/>
-            <w:r>
-              <w:rPr>
-                <w:sz w:val="15"/>
-              </w:rPr>
-              <w:t>Pre-dates modern web tools; no task-based evaluation</w:t>
+                <w:sz w:val="14"/>
+              </w:rPr>
+              <w:t>Extraction errors propagate into the graph; no visualization or provenance for analysts</w:t>
             </w:r>
           </w:p>
         </w:tc>
@@ -2004,85 +2104,99 @@
       <w:tr>
         <w:tc>
           <w:tcPr>
+            <w:tcW w:type="dxa" w:w="1417"/>
+          </w:tcPr>
+          <w:p>
+            <w:r/>
+            <w:r>
+              <w:rPr>
+                <w:sz w:val="14"/>
+              </w:rPr>
+              <w:t>[L6] Yan, Yang, Shi, Fang, Li &amp; Ye (2023)</w:t>
+            </w:r>
+          </w:p>
+        </w:tc>
+        <w:tc>
+          <w:tcPr>
+            <w:tcW w:type="dxa" w:w="964"/>
+          </w:tcPr>
+          <w:p>
+            <w:r/>
+            <w:r>
+              <w:rPr>
+                <w:sz w:val="14"/>
+              </w:rPr>
+              <w:t>Graph analytics</w:t>
+            </w:r>
+          </w:p>
+        </w:tc>
+        <w:tc>
+          <w:tcPr>
+            <w:tcW w:type="dxa" w:w="1587"/>
+          </w:tcPr>
+          <w:p>
+            <w:r/>
+            <w:r>
+              <w:rPr>
+                <w:sz w:val="14"/>
+              </w:rPr>
+              <w:t>Survey of graph-mining methods for cyber security (centrality, community detection, GNNs)</w:t>
+            </w:r>
+          </w:p>
+        </w:tc>
+        <w:tc>
+          <w:tcPr>
+            <w:tcW w:type="dxa" w:w="1247"/>
+          </w:tcPr>
+          <w:p>
+            <w:r/>
+            <w:r>
+              <w:rPr>
+                <w:sz w:val="14"/>
+              </w:rPr>
+              <w:t>Systematic survey</w:t>
+            </w:r>
+          </w:p>
+        </w:tc>
+        <w:tc>
+          <w:tcPr>
+            <w:tcW w:type="dxa" w:w="1247"/>
+          </w:tcPr>
+          <w:p>
+            <w:r/>
+            <w:r>
+              <w:rPr>
+                <w:sz w:val="14"/>
+              </w:rPr>
+              <w:t>Published graph-based security studies and datasets</w:t>
+            </w:r>
+          </w:p>
+        </w:tc>
+        <w:tc>
+          <w:tcPr>
+            <w:tcW w:type="dxa" w:w="1701"/>
+          </w:tcPr>
+          <w:p>
+            <w:r/>
+            <w:r>
+              <w:rPr>
+                <w:sz w:val="14"/>
+              </w:rPr>
+              <w:t>Graphs are a natural model for relations between security entities; graph mining improves detection and attribution</w:t>
+            </w:r>
+          </w:p>
+        </w:tc>
+        <w:tc>
+          <w:tcPr>
             <w:tcW w:type="dxa" w:w="1474"/>
           </w:tcPr>
           <w:p>
             <w:r/>
             <w:r>
               <w:rPr>
-                <w:sz w:val="15"/>
-              </w:rPr>
-              <w:t>[L6] Ghoniem, Fekete &amp; Castagliola (2004)</w:t>
-            </w:r>
-          </w:p>
-        </w:tc>
-        <w:tc>
-          <w:tcPr>
-            <w:tcW w:type="dxa" w:w="1134"/>
-          </w:tcPr>
-          <w:p>
-            <w:r/>
-            <w:r>
-              <w:rPr>
-                <w:sz w:val="15"/>
-              </w:rPr>
-              <w:t>Graph readability</w:t>
-            </w:r>
-          </w:p>
-        </w:tc>
-        <w:tc>
-          <w:tcPr>
-            <w:tcW w:type="dxa" w:w="1928"/>
-          </w:tcPr>
-          <w:p>
-            <w:r/>
-            <w:r>
-              <w:rPr>
-                <w:sz w:val="15"/>
-              </w:rPr>
-              <w:t>Controlled comparison of node-link diagrams vs adjacency matrices</w:t>
-            </w:r>
-          </w:p>
-        </w:tc>
-        <w:tc>
-          <w:tcPr>
-            <w:tcW w:type="dxa" w:w="1814"/>
-          </w:tcPr>
-          <w:p>
-            <w:r/>
-            <w:r>
-              <w:rPr>
-                <w:sz w:val="15"/>
-              </w:rPr>
-              <w:t>User study, 36 participants, 7 tasks on random graphs</w:t>
-            </w:r>
-          </w:p>
-        </w:tc>
-        <w:tc>
-          <w:tcPr>
-            <w:tcW w:type="dxa" w:w="1814"/>
-          </w:tcPr>
-          <w:p>
-            <w:r/>
-            <w:r>
-              <w:rPr>
-                <w:sz w:val="15"/>
-              </w:rPr>
-              <w:t>Node-link diagrams read better for small, sparse graphs and path tasks; matrices win for large or dense graphs</w:t>
-            </w:r>
-          </w:p>
-        </w:tc>
-        <w:tc>
-          <w:tcPr>
-            <w:tcW w:type="dxa" w:w="1474"/>
-          </w:tcPr>
-          <w:p>
-            <w:r/>
-            <w:r>
-              <w:rPr>
-                <w:sz w:val="15"/>
-              </w:rPr>
-              <w:t>Synthetic graphs; no domain semantics</w:t>
+                <w:sz w:val="14"/>
+              </w:rPr>
+              <w:t>Focus on algorithms, not on how graphs are visualized or misread</w:t>
             </w:r>
           </w:p>
         </w:tc>
@@ -2090,85 +2204,99 @@
       <w:tr>
         <w:tc>
           <w:tcPr>
+            <w:tcW w:type="dxa" w:w="1417"/>
+          </w:tcPr>
+          <w:p>
+            <w:r/>
+            <w:r>
+              <w:rPr>
+                <w:sz w:val="14"/>
+              </w:rPr>
+              <w:t>[L7] Pete, Hughes, Chua &amp; Bada (2020)</w:t>
+            </w:r>
+          </w:p>
+        </w:tc>
+        <w:tc>
+          <w:tcPr>
+            <w:tcW w:type="dxa" w:w="964"/>
+          </w:tcPr>
+          <w:p>
+            <w:r/>
+            <w:r>
+              <w:rPr>
+                <w:sz w:val="14"/>
+              </w:rPr>
+              <w:t>Social-network analysis</w:t>
+            </w:r>
+          </w:p>
+        </w:tc>
+        <w:tc>
+          <w:tcPr>
+            <w:tcW w:type="dxa" w:w="1587"/>
+          </w:tcPr>
+          <w:p>
+            <w:r/>
+            <w:r>
+              <w:rPr>
+                <w:sz w:val="14"/>
+              </w:rPr>
+              <w:t>SNA of user-interaction networks in six dark-web forums</w:t>
+            </w:r>
+          </w:p>
+        </w:tc>
+        <w:tc>
+          <w:tcPr>
+            <w:tcW w:type="dxa" w:w="1247"/>
+          </w:tcPr>
+          <w:p>
+            <w:r/>
+            <w:r>
+              <w:rPr>
+                <w:sz w:val="14"/>
+              </w:rPr>
+              <w:t>Network construction, centrality, community detection</w:t>
+            </w:r>
+          </w:p>
+        </w:tc>
+        <w:tc>
+          <w:tcPr>
+            <w:tcW w:type="dxa" w:w="1247"/>
+          </w:tcPr>
+          <w:p>
+            <w:r/>
+            <w:r>
+              <w:rPr>
+                <w:sz w:val="14"/>
+              </w:rPr>
+              <w:t>Six dark-web forum datasets</w:t>
+            </w:r>
+          </w:p>
+        </w:tc>
+        <w:tc>
+          <w:tcPr>
+            <w:tcW w:type="dxa" w:w="1701"/>
+          </w:tcPr>
+          <w:p>
+            <w:r/>
+            <w:r>
+              <w:rPr>
+                <w:sz w:val="14"/>
+              </w:rPr>
+              <w:t>Only a small subset of users is influential; forums differ in structure</w:t>
+            </w:r>
+          </w:p>
+        </w:tc>
+        <w:tc>
+          <w:tcPr>
             <w:tcW w:type="dxa" w:w="1474"/>
           </w:tcPr>
           <w:p>
             <w:r/>
             <w:r>
               <w:rPr>
-                <w:sz w:val="15"/>
-              </w:rPr>
-              <w:t>[L7] Blondel et al. (2008) Louvain</w:t>
-            </w:r>
-          </w:p>
-        </w:tc>
-        <w:tc>
-          <w:tcPr>
-            <w:tcW w:type="dxa" w:w="1134"/>
-          </w:tcPr>
-          <w:p>
-            <w:r/>
-            <w:r>
-              <w:rPr>
-                <w:sz w:val="15"/>
-              </w:rPr>
-              <w:t>Graph analytics</w:t>
-            </w:r>
-          </w:p>
-        </w:tc>
-        <w:tc>
-          <w:tcPr>
-            <w:tcW w:type="dxa" w:w="1928"/>
-          </w:tcPr>
-          <w:p>
-            <w:r/>
-            <w:r>
-              <w:rPr>
-                <w:sz w:val="15"/>
-              </w:rPr>
-              <w:t>Greedy modularity optimisation for community detection</w:t>
-            </w:r>
-          </w:p>
-        </w:tc>
-        <w:tc>
-          <w:tcPr>
-            <w:tcW w:type="dxa" w:w="1814"/>
-          </w:tcPr>
-          <w:p>
-            <w:r/>
-            <w:r>
-              <w:rPr>
-                <w:sz w:val="15"/>
-              </w:rPr>
-              <w:t>Algorithm + evaluation on networks up to 118 M nodes</w:t>
-            </w:r>
-          </w:p>
-        </w:tc>
-        <w:tc>
-          <w:tcPr>
-            <w:tcW w:type="dxa" w:w="1814"/>
-          </w:tcPr>
-          <w:p>
-            <w:r/>
-            <w:r>
-              <w:rPr>
-                <w:sz w:val="15"/>
-              </w:rPr>
-              <w:t>Fast, high-modularity communities at very large scale</w:t>
-            </w:r>
-          </w:p>
-        </w:tc>
-        <w:tc>
-          <w:tcPr>
-            <w:tcW w:type="dxa" w:w="1474"/>
-          </w:tcPr>
-          <w:p>
-            <w:r/>
-            <w:r>
-              <w:rPr>
-                <w:sz w:val="15"/>
-              </w:rPr>
-              <w:t>Resolution limit; non-deterministic; communities are not ground truth</w:t>
+                <w:sz w:val="14"/>
+              </w:rPr>
+              <w:t>Forum data only; links are replies, not verified relationships</w:t>
             </w:r>
           </w:p>
         </w:tc>
@@ -2176,85 +2304,99 @@
       <w:tr>
         <w:tc>
           <w:tcPr>
+            <w:tcW w:type="dxa" w:w="1417"/>
+          </w:tcPr>
+          <w:p>
+            <w:r/>
+            <w:r>
+              <w:rPr>
+                <w:sz w:val="14"/>
+              </w:rPr>
+              <w:t>[L8] Hu, Wang, Guin &amp; Zhu (2018)</w:t>
+            </w:r>
+          </w:p>
+        </w:tc>
+        <w:tc>
+          <w:tcPr>
+            <w:tcW w:type="dxa" w:w="964"/>
+          </w:tcPr>
+          <w:p>
+            <w:r/>
+            <w:r>
+              <w:rPr>
+                <w:sz w:val="14"/>
+              </w:rPr>
+              <w:t>Geographic visualization</w:t>
+            </w:r>
+          </w:p>
+        </w:tc>
+        <w:tc>
+          <w:tcPr>
+            <w:tcW w:type="dxa" w:w="1587"/>
+          </w:tcPr>
+          <w:p>
+            <w:r/>
+            <w:r>
+              <w:rPr>
+                <w:sz w:val="14"/>
+              </w:rPr>
+              <w:t>Spatio-temporal kernel density estimation for hotspot mapping</w:t>
+            </w:r>
+          </w:p>
+        </w:tc>
+        <w:tc>
+          <w:tcPr>
+            <w:tcW w:type="dxa" w:w="1247"/>
+          </w:tcPr>
+          <w:p>
+            <w:r/>
+            <w:r>
+              <w:rPr>
+                <w:sz w:val="14"/>
+              </w:rPr>
+              <w:t>STKDE with predictive-accuracy evaluation</w:t>
+            </w:r>
+          </w:p>
+        </w:tc>
+        <w:tc>
+          <w:tcPr>
+            <w:tcW w:type="dxa" w:w="1247"/>
+          </w:tcPr>
+          <w:p>
+            <w:r/>
+            <w:r>
+              <w:rPr>
+                <w:sz w:val="14"/>
+              </w:rPr>
+              <w:t>City crime incident records</w:t>
+            </w:r>
+          </w:p>
+        </w:tc>
+        <w:tc>
+          <w:tcPr>
+            <w:tcW w:type="dxa" w:w="1701"/>
+          </w:tcPr>
+          <w:p>
+            <w:r/>
+            <w:r>
+              <w:rPr>
+                <w:sz w:val="14"/>
+              </w:rPr>
+              <w:t>Adding time to KDE improves hotspot prediction; bandwidth choice changes the map</w:t>
+            </w:r>
+          </w:p>
+        </w:tc>
+        <w:tc>
+          <w:tcPr>
             <w:tcW w:type="dxa" w:w="1474"/>
           </w:tcPr>
           <w:p>
             <w:r/>
             <w:r>
               <w:rPr>
-                <w:sz w:val="15"/>
-              </w:rPr>
-              <w:t>[L8] Krebs (2002)</w:t>
-            </w:r>
-          </w:p>
-        </w:tc>
-        <w:tc>
-          <w:tcPr>
-            <w:tcW w:type="dxa" w:w="1134"/>
-          </w:tcPr>
-          <w:p>
-            <w:r/>
-            <w:r>
-              <w:rPr>
-                <w:sz w:val="15"/>
-              </w:rPr>
-              <w:t>Social-network analysis</w:t>
-            </w:r>
-          </w:p>
-        </w:tc>
-        <w:tc>
-          <w:tcPr>
-            <w:tcW w:type="dxa" w:w="1928"/>
-          </w:tcPr>
-          <w:p>
-            <w:r/>
-            <w:r>
-              <w:rPr>
-                <w:sz w:val="15"/>
-              </w:rPr>
-              <w:t>SNA of the 9/11 hijacker network built from public news sources</w:t>
-            </w:r>
-          </w:p>
-        </w:tc>
-        <w:tc>
-          <w:tcPr>
-            <w:tcW w:type="dxa" w:w="1814"/>
-          </w:tcPr>
-          <w:p>
-            <w:r/>
-            <w:r>
-              <w:rPr>
-                <w:sz w:val="15"/>
-              </w:rPr>
-              <w:t>Network reconstruction from open sources; centrality</w:t>
-            </w:r>
-          </w:p>
-        </w:tc>
-        <w:tc>
-          <w:tcPr>
-            <w:tcW w:type="dxa" w:w="1814"/>
-          </w:tcPr>
-          <w:p>
-            <w:r/>
-            <w:r>
-              <w:rPr>
-                <w:sz w:val="15"/>
-              </w:rPr>
-              <w:t>Key brokers identifiable from public data; covert networks are sparse</w:t>
-            </w:r>
-          </w:p>
-        </w:tc>
-        <w:tc>
-          <w:tcPr>
-            <w:tcW w:type="dxa" w:w="1474"/>
-          </w:tcPr>
-          <w:p>
-            <w:r/>
-            <w:r>
-              <w:rPr>
-                <w:sz w:val="15"/>
-              </w:rPr>
-              <w:t>Retrospective; incomplete, noisy data; single case</w:t>
+                <w:sz w:val="14"/>
+              </w:rPr>
+              <w:t>Physical crime, not network infrastructure; parameter-sensitive</w:t>
             </w:r>
           </w:p>
         </w:tc>
@@ -2262,85 +2404,99 @@
       <w:tr>
         <w:tc>
           <w:tcPr>
+            <w:tcW w:type="dxa" w:w="1417"/>
+          </w:tcPr>
+          <w:p>
+            <w:r/>
+            <w:r>
+              <w:rPr>
+                <w:sz w:val="14"/>
+              </w:rPr>
+              <w:t>[L9] Gouel, Vermeulen, Beverly, Fourmaux &amp; Friedman (2021)</w:t>
+            </w:r>
+          </w:p>
+        </w:tc>
+        <w:tc>
+          <w:tcPr>
+            <w:tcW w:type="dxa" w:w="964"/>
+          </w:tcPr>
+          <w:p>
+            <w:r/>
+            <w:r>
+              <w:rPr>
+                <w:sz w:val="14"/>
+              </w:rPr>
+              <w:t>Geolocation reliability</w:t>
+            </w:r>
+          </w:p>
+        </w:tc>
+        <w:tc>
+          <w:tcPr>
+            <w:tcW w:type="dxa" w:w="1587"/>
+          </w:tcPr>
+          <w:p>
+            <w:r/>
+            <w:r>
+              <w:rPr>
+                <w:sz w:val="14"/>
+              </w:rPr>
+              <w:t>Longitudinal stability study of an IP geolocation database</w:t>
+            </w:r>
+          </w:p>
+        </w:tc>
+        <w:tc>
+          <w:tcPr>
+            <w:tcW w:type="dxa" w:w="1247"/>
+          </w:tcPr>
+          <w:p>
+            <w:r/>
+            <w:r>
+              <w:rPr>
+                <w:sz w:val="14"/>
+              </w:rPr>
+              <w:t>Snapshot comparison; reproduction of a prior study</w:t>
+            </w:r>
+          </w:p>
+        </w:tc>
+        <w:tc>
+          <w:tcPr>
+            <w:tcW w:type="dxa" w:w="1247"/>
+          </w:tcPr>
+          <w:p>
+            <w:r/>
+            <w:r>
+              <w:rPr>
+                <w:sz w:val="14"/>
+              </w:rPr>
+              <w:t>Weekly snapshots of a commercial geolocation database</w:t>
+            </w:r>
+          </w:p>
+        </w:tc>
+        <w:tc>
+          <w:tcPr>
+            <w:tcW w:type="dxa" w:w="1701"/>
+          </w:tcPr>
+          <w:p>
+            <w:r/>
+            <w:r>
+              <w:rPr>
+                <w:sz w:val="14"/>
+              </w:rPr>
+              <w:t>Successive snapshots differ significantly; median error shifted &gt;100 km and coverage by 30%</w:t>
+            </w:r>
+          </w:p>
+        </w:tc>
+        <w:tc>
+          <w:tcPr>
             <w:tcW w:type="dxa" w:w="1474"/>
           </w:tcPr>
           <w:p>
             <w:r/>
             <w:r>
               <w:rPr>
-                <w:sz w:val="15"/>
-              </w:rPr>
-              <w:t>[L9] Xu &amp; Chen (2005)</w:t>
-            </w:r>
-          </w:p>
-        </w:tc>
-        <w:tc>
-          <w:tcPr>
-            <w:tcW w:type="dxa" w:w="1134"/>
-          </w:tcPr>
-          <w:p>
-            <w:r/>
-            <w:r>
-              <w:rPr>
-                <w:sz w:val="15"/>
-              </w:rPr>
-              <w:t>Criminal network analysis</w:t>
-            </w:r>
-          </w:p>
-        </w:tc>
-        <w:tc>
-          <w:tcPr>
-            <w:tcW w:type="dxa" w:w="1928"/>
-          </w:tcPr>
-          <w:p>
-            <w:r/>
-            <w:r>
-              <w:rPr>
-                <w:sz w:val="15"/>
-              </w:rPr>
-              <w:t>SNA + visualization for criminal networks (CrimeNet Explorer)</w:t>
-            </w:r>
-          </w:p>
-        </w:tc>
-        <w:tc>
-          <w:tcPr>
-            <w:tcW w:type="dxa" w:w="1814"/>
-          </w:tcPr>
-          <w:p>
-            <w:r/>
-            <w:r>
-              <w:rPr>
-                <w:sz w:val="15"/>
-              </w:rPr>
-              <w:t>Concept-space linkage, hierarchical clustering, blockmodelling on police records</w:t>
-            </w:r>
-          </w:p>
-        </w:tc>
-        <w:tc>
-          <w:tcPr>
-            <w:tcW w:type="dxa" w:w="1814"/>
-          </w:tcPr>
-          <w:p>
-            <w:r/>
-            <w:r>
-              <w:rPr>
-                <w:sz w:val="15"/>
-              </w:rPr>
-              <w:t>Network visualisation helps identify subgroups and central members</w:t>
-            </w:r>
-          </w:p>
-        </w:tc>
-        <w:tc>
-          <w:tcPr>
-            <w:tcW w:type="dxa" w:w="1474"/>
-          </w:tcPr>
-          <w:p>
-            <w:r/>
-            <w:r>
-              <w:rPr>
-                <w:sz w:val="15"/>
-              </w:rPr>
-              <w:t>Police records, not open data; link reliability not modelled</w:t>
+                <w:sz w:val="14"/>
+              </w:rPr>
+              <w:t>One database; ground truth limited to some address types</w:t>
             </w:r>
           </w:p>
         </w:tc>
@@ -2348,85 +2504,99 @@
       <w:tr>
         <w:tc>
           <w:tcPr>
+            <w:tcW w:type="dxa" w:w="1417"/>
+          </w:tcPr>
+          <w:p>
+            <w:r/>
+            <w:r>
+              <w:rPr>
+                <w:sz w:val="14"/>
+              </w:rPr>
+              <w:t>[L10] Jiang, Jayatilaka, Nasim, Grobler, Zahedi &amp; Babar (2022)</w:t>
+            </w:r>
+          </w:p>
+        </w:tc>
+        <w:tc>
+          <w:tcPr>
+            <w:tcW w:type="dxa" w:w="964"/>
+          </w:tcPr>
+          <w:p>
+            <w:r/>
+            <w:r>
+              <w:rPr>
+                <w:sz w:val="14"/>
+              </w:rPr>
+              <w:t>Cyber dashboards</w:t>
+            </w:r>
+          </w:p>
+        </w:tc>
+        <w:tc>
+          <w:tcPr>
+            <w:tcW w:type="dxa" w:w="1587"/>
+          </w:tcPr>
+          <w:p>
+            <w:r/>
+            <w:r>
+              <w:rPr>
+                <w:sz w:val="14"/>
+              </w:rPr>
+              <w:t>Systematic review of cyber situational-awareness visualizations</w:t>
+            </w:r>
+          </w:p>
+        </w:tc>
+        <w:tc>
+          <w:tcPr>
+            <w:tcW w:type="dxa" w:w="1247"/>
+          </w:tcPr>
+          <w:p>
+            <w:r/>
+            <w:r>
+              <w:rPr>
+                <w:sz w:val="14"/>
+              </w:rPr>
+              <w:t>Systematic literature review</w:t>
+            </w:r>
+          </w:p>
+        </w:tc>
+        <w:tc>
+          <w:tcPr>
+            <w:tcW w:type="dxa" w:w="1247"/>
+          </w:tcPr>
+          <w:p>
+            <w:r/>
+            <w:r>
+              <w:rPr>
+                <w:sz w:val="14"/>
+              </w:rPr>
+              <w:t>54 publications</w:t>
+            </w:r>
+          </w:p>
+        </w:tc>
+        <w:tc>
+          <w:tcPr>
+            <w:tcW w:type="dxa" w:w="1701"/>
+          </w:tcPr>
+          <w:p>
+            <w:r/>
+            <w:r>
+              <w:rPr>
+                <w:sz w:val="14"/>
+              </w:rPr>
+              <w:t>Most visualizations serve operational staff and the perception level; impact and projection are rarely shown</w:t>
+            </w:r>
+          </w:p>
+        </w:tc>
+        <w:tc>
+          <w:tcPr>
             <w:tcW w:type="dxa" w:w="1474"/>
           </w:tcPr>
           <w:p>
             <w:r/>
             <w:r>
               <w:rPr>
-                <w:sz w:val="15"/>
-              </w:rPr>
-              <w:t>[L10] Chainey, Tompson &amp; Uhlig (2008)</w:t>
-            </w:r>
-          </w:p>
-        </w:tc>
-        <w:tc>
-          <w:tcPr>
-            <w:tcW w:type="dxa" w:w="1134"/>
-          </w:tcPr>
-          <w:p>
-            <w:r/>
-            <w:r>
-              <w:rPr>
-                <w:sz w:val="15"/>
-              </w:rPr>
-              <w:t>Geographic visualization</w:t>
-            </w:r>
-          </w:p>
-        </w:tc>
-        <w:tc>
-          <w:tcPr>
-            <w:tcW w:type="dxa" w:w="1928"/>
-          </w:tcPr>
-          <w:p>
-            <w:r/>
-            <w:r>
-              <w:rPr>
-                <w:sz w:val="15"/>
-              </w:rPr>
-              <w:t>Comparison of hotspot mapping methods (KDE, grids, ellipses, thematic)</w:t>
-            </w:r>
-          </w:p>
-        </w:tc>
-        <w:tc>
-          <w:tcPr>
-            <w:tcW w:type="dxa" w:w="1814"/>
-          </w:tcPr>
-          <w:p>
-            <w:r/>
-            <w:r>
-              <w:rPr>
-                <w:sz w:val="15"/>
-              </w:rPr>
-              <w:t>Prediction accuracy index on UK crime data</w:t>
-            </w:r>
-          </w:p>
-        </w:tc>
-        <w:tc>
-          <w:tcPr>
-            <w:tcW w:type="dxa" w:w="1814"/>
-          </w:tcPr>
-          <w:p>
-            <w:r/>
-            <w:r>
-              <w:rPr>
-                <w:sz w:val="15"/>
-              </w:rPr>
-              <w:t>Kernel density estimation predicts future hotspots best; method choice changes the conclusion</w:t>
-            </w:r>
-          </w:p>
-        </w:tc>
-        <w:tc>
-          <w:tcPr>
-            <w:tcW w:type="dxa" w:w="1474"/>
-          </w:tcPr>
-          <w:p>
-            <w:r/>
-            <w:r>
-              <w:rPr>
-                <w:sz w:val="15"/>
-              </w:rPr>
-              <w:t>Physical crime, not network infrastructure</w:t>
+                <w:sz w:val="14"/>
+              </w:rPr>
+              <w:t>Review only; does not propose or test a visualization design</w:t>
             </w:r>
           </w:p>
         </w:tc>
@@ -2434,85 +2604,99 @@
       <w:tr>
         <w:tc>
           <w:tcPr>
+            <w:tcW w:type="dxa" w:w="1417"/>
+          </w:tcPr>
+          <w:p>
+            <w:r/>
+            <w:r>
+              <w:rPr>
+                <w:sz w:val="14"/>
+              </w:rPr>
+              <w:t>[L11] Komadina, Mihajlović &amp; Groš (2022)</w:t>
+            </w:r>
+          </w:p>
+        </w:tc>
+        <w:tc>
+          <w:tcPr>
+            <w:tcW w:type="dxa" w:w="964"/>
+          </w:tcPr>
+          <w:p>
+            <w:r/>
+            <w:r>
+              <w:rPr>
+                <w:sz w:val="14"/>
+              </w:rPr>
+              <w:t>Security visualization</w:t>
+            </w:r>
+          </w:p>
+        </w:tc>
+        <w:tc>
+          <w:tcPr>
+            <w:tcW w:type="dxa" w:w="1587"/>
+          </w:tcPr>
+          <w:p>
+            <w:r/>
+            <w:r>
+              <w:rPr>
+                <w:sz w:val="14"/>
+              </w:rPr>
+              <w:t>Design-space analysis of cyber-security visualizations</w:t>
+            </w:r>
+          </w:p>
+        </w:tc>
+        <w:tc>
+          <w:tcPr>
+            <w:tcW w:type="dxa" w:w="1247"/>
+          </w:tcPr>
+          <w:p>
+            <w:r/>
+            <w:r>
+              <w:rPr>
+                <w:sz w:val="14"/>
+              </w:rPr>
+              <w:t>Classification by data, task, encoding, interaction, evaluation</w:t>
+            </w:r>
+          </w:p>
+        </w:tc>
+        <w:tc>
+          <w:tcPr>
+            <w:tcW w:type="dxa" w:w="1247"/>
+          </w:tcPr>
+          <w:p>
+            <w:r/>
+            <w:r>
+              <w:rPr>
+                <w:sz w:val="14"/>
+              </w:rPr>
+              <w:t>60 VizSec papers (2016–2021)</w:t>
+            </w:r>
+          </w:p>
+        </w:tc>
+        <w:tc>
+          <w:tcPr>
+            <w:tcW w:type="dxa" w:w="1701"/>
+          </w:tcPr>
+          <w:p>
+            <w:r/>
+            <w:r>
+              <w:rPr>
+                <w:sz w:val="14"/>
+              </w:rPr>
+              <w:t>Provides a taxonomy of data, tasks and encodings used in security visualization and shows which combinations are under-explored</w:t>
+            </w:r>
+          </w:p>
+        </w:tc>
+        <w:tc>
+          <w:tcPr>
             <w:tcW w:type="dxa" w:w="1474"/>
           </w:tcPr>
           <w:p>
             <w:r/>
             <w:r>
               <w:rPr>
-                <w:sz w:val="15"/>
-              </w:rPr>
-              <w:t>[L11] Poese et al. (2011)</w:t>
-            </w:r>
-          </w:p>
-        </w:tc>
-        <w:tc>
-          <w:tcPr>
-            <w:tcW w:type="dxa" w:w="1134"/>
-          </w:tcPr>
-          <w:p>
-            <w:r/>
-            <w:r>
-              <w:rPr>
-                <w:sz w:val="15"/>
-              </w:rPr>
-              <w:t>Geolocation reliability</w:t>
-            </w:r>
-          </w:p>
-        </w:tc>
-        <w:tc>
-          <w:tcPr>
-            <w:tcW w:type="dxa" w:w="1928"/>
-          </w:tcPr>
-          <w:p>
-            <w:r/>
-            <w:r>
-              <w:rPr>
-                <w:sz w:val="15"/>
-              </w:rPr>
-              <w:t>Accuracy study of commercial IP geolocation databases</w:t>
-            </w:r>
-          </w:p>
-        </w:tc>
-        <w:tc>
-          <w:tcPr>
-            <w:tcW w:type="dxa" w:w="1814"/>
-          </w:tcPr>
-          <w:p>
-            <w:r/>
-            <w:r>
-              <w:rPr>
-                <w:sz w:val="15"/>
-              </w:rPr>
-              <w:t>Comparison against ground truth from a large ISP</w:t>
-            </w:r>
-          </w:p>
-        </w:tc>
-        <w:tc>
-          <w:tcPr>
-            <w:tcW w:type="dxa" w:w="1814"/>
-          </w:tcPr>
-          <w:p>
-            <w:r/>
-            <w:r>
-              <w:rPr>
-                <w:sz w:val="15"/>
-              </w:rPr>
-              <w:t>Country-level geolocation is mostly right, city-level often wrong; databases disagree</w:t>
-            </w:r>
-          </w:p>
-        </w:tc>
-        <w:tc>
-          <w:tcPr>
-            <w:tcW w:type="dxa" w:w="1474"/>
-          </w:tcPr>
-          <w:p>
-            <w:r/>
-            <w:r>
-              <w:rPr>
-                <w:sz w:val="15"/>
-              </w:rPr>
-              <w:t>Single ISP ground truth; databases change over time</w:t>
+                <w:sz w:val="14"/>
+              </w:rPr>
+              <w:t>Limited to one venue and six years</w:t>
             </w:r>
           </w:p>
         </w:tc>
@@ -2520,85 +2704,99 @@
       <w:tr>
         <w:tc>
           <w:tcPr>
+            <w:tcW w:type="dxa" w:w="1417"/>
+          </w:tcPr>
+          <w:p>
+            <w:r/>
+            <w:r>
+              <w:rPr>
+                <w:sz w:val="14"/>
+              </w:rPr>
+              <w:t>[L12] Li, Dunn, Pearce, McCoy, Voelker, Savage &amp; Levchenko (2019)</w:t>
+            </w:r>
+          </w:p>
+        </w:tc>
+        <w:tc>
+          <w:tcPr>
+            <w:tcW w:type="dxa" w:w="964"/>
+          </w:tcPr>
+          <w:p>
+            <w:r/>
+            <w:r>
+              <w:rPr>
+                <w:sz w:val="14"/>
+              </w:rPr>
+              <w:t>Threat-intel feeds</w:t>
+            </w:r>
+          </w:p>
+        </w:tc>
+        <w:tc>
+          <w:tcPr>
+            <w:tcW w:type="dxa" w:w="1587"/>
+          </w:tcPr>
+          <w:p>
+            <w:r/>
+            <w:r>
+              <w:rPr>
+                <w:sz w:val="14"/>
+              </w:rPr>
+              <w:t>Metrics for comparing threat-intelligence feeds</w:t>
+            </w:r>
+          </w:p>
+        </w:tc>
+        <w:tc>
+          <w:tcPr>
+            <w:tcW w:type="dxa" w:w="1247"/>
+          </w:tcPr>
+          <w:p>
+            <w:r/>
+            <w:r>
+              <w:rPr>
+                <w:sz w:val="14"/>
+              </w:rPr>
+              <w:t>Quantitative feed comparison against external measurements</w:t>
+            </w:r>
+          </w:p>
+        </w:tc>
+        <w:tc>
+          <w:tcPr>
+            <w:tcW w:type="dxa" w:w="1247"/>
+          </w:tcPr>
+          <w:p>
+            <w:r/>
+            <w:r>
+              <w:rPr>
+                <w:sz w:val="14"/>
+              </w:rPr>
+              <w:t>Public and commercial IP and hash feeds</w:t>
+            </w:r>
+          </w:p>
+        </w:tc>
+        <w:tc>
+          <w:tcPr>
+            <w:tcW w:type="dxa" w:w="1701"/>
+          </w:tcPr>
+          <w:p>
+            <w:r/>
+            <w:r>
+              <w:rPr>
+                <w:sz w:val="14"/>
+              </w:rPr>
+              <w:t>Feeds overlap little and have limited coverage and accuracy</w:t>
+            </w:r>
+          </w:p>
+        </w:tc>
+        <w:tc>
+          <w:tcPr>
             <w:tcW w:type="dxa" w:w="1474"/>
           </w:tcPr>
           <w:p>
             <w:r/>
             <w:r>
               <w:rPr>
-                <w:sz w:val="15"/>
-              </w:rPr>
-              <w:t>[L12] Shiravi, Shiravi &amp; Ghorbani (2012)</w:t>
-            </w:r>
-          </w:p>
-        </w:tc>
-        <w:tc>
-          <w:tcPr>
-            <w:tcW w:type="dxa" w:w="1134"/>
-          </w:tcPr>
-          <w:p>
-            <w:r/>
-            <w:r>
-              <w:rPr>
-                <w:sz w:val="15"/>
-              </w:rPr>
-              <w:t>Security visualization</w:t>
-            </w:r>
-          </w:p>
-        </w:tc>
-        <w:tc>
-          <w:tcPr>
-            <w:tcW w:type="dxa" w:w="1928"/>
-          </w:tcPr>
-          <w:p>
-            <w:r/>
-            <w:r>
-              <w:rPr>
-                <w:sz w:val="15"/>
-              </w:rPr>
-              <w:t>Survey and taxonomy of network-security visualization systems</w:t>
-            </w:r>
-          </w:p>
-        </w:tc>
-        <w:tc>
-          <w:tcPr>
-            <w:tcW w:type="dxa" w:w="1814"/>
-          </w:tcPr>
-          <w:p>
-            <w:r/>
-            <w:r>
-              <w:rPr>
-                <w:sz w:val="15"/>
-              </w:rPr>
-              <w:t>Classification by data source and use case</w:t>
-            </w:r>
-          </w:p>
-        </w:tc>
-        <w:tc>
-          <w:tcPr>
-            <w:tcW w:type="dxa" w:w="1814"/>
-          </w:tcPr>
-          <w:p>
-            <w:r/>
-            <w:r>
-              <w:rPr>
-                <w:sz w:val="15"/>
-              </w:rPr>
-              <w:t>Most systems target one data type; evaluation is rare and informal</w:t>
-            </w:r>
-          </w:p>
-        </w:tc>
-        <w:tc>
-          <w:tcPr>
-            <w:tcW w:type="dxa" w:w="1474"/>
-          </w:tcPr>
-          <w:p>
-            <w:r/>
-            <w:r>
-              <w:rPr>
-                <w:sz w:val="15"/>
-              </w:rPr>
-              <w:t>Pre-dates threat-intel feeds; few OSINT systems</w:t>
+                <w:sz w:val="14"/>
+              </w:rPr>
+              <w:t>No visualization; feeds analysed as sets, not as relationships</w:t>
             </w:r>
           </w:p>
         </w:tc>
@@ -2606,85 +2804,99 @@
       <w:tr>
         <w:tc>
           <w:tcPr>
+            <w:tcW w:type="dxa" w:w="1417"/>
+          </w:tcPr>
+          <w:p>
+            <w:r/>
+            <w:r>
+              <w:rPr>
+                <w:sz w:val="14"/>
+              </w:rPr>
+              <w:t>[L13] Bouwman, Griffioen, Egbers, Doerr, Klievink &amp; van Eeten (2020)</w:t>
+            </w:r>
+          </w:p>
+        </w:tc>
+        <w:tc>
+          <w:tcPr>
+            <w:tcW w:type="dxa" w:w="964"/>
+          </w:tcPr>
+          <w:p>
+            <w:r/>
+            <w:r>
+              <w:rPr>
+                <w:sz w:val="14"/>
+              </w:rPr>
+              <w:t>Threat-intel feeds</w:t>
+            </w:r>
+          </w:p>
+        </w:tc>
+        <w:tc>
+          <w:tcPr>
+            <w:tcW w:type="dxa" w:w="1587"/>
+          </w:tcPr>
+          <w:p>
+            <w:r/>
+            <w:r>
+              <w:rPr>
+                <w:sz w:val="14"/>
+              </w:rPr>
+              <w:t>Added value of commercial threat intelligence</w:t>
+            </w:r>
+          </w:p>
+        </w:tc>
+        <w:tc>
+          <w:tcPr>
+            <w:tcW w:type="dxa" w:w="1247"/>
+          </w:tcPr>
+          <w:p>
+            <w:r/>
+            <w:r>
+              <w:rPr>
+                <w:sz w:val="14"/>
+              </w:rPr>
+              <w:t>Feed overlap analysis + 14 practitioner interviews</w:t>
+            </w:r>
+          </w:p>
+        </w:tc>
+        <w:tc>
+          <w:tcPr>
+            <w:tcW w:type="dxa" w:w="1247"/>
+          </w:tcPr>
+          <w:p>
+            <w:r/>
+            <w:r>
+              <w:rPr>
+                <w:sz w:val="14"/>
+              </w:rPr>
+              <w:t>Two commercial vendors and four open feeds</w:t>
+            </w:r>
+          </w:p>
+        </w:tc>
+        <w:tc>
+          <w:tcPr>
+            <w:tcW w:type="dxa" w:w="1701"/>
+          </w:tcPr>
+          <w:p>
+            <w:r/>
+            <w:r>
+              <w:rPr>
+                <w:sz w:val="14"/>
+              </w:rPr>
+              <w:t>Only 2.5–4% indicator overlap for the same 22 actors; analysts judge TI informally</w:t>
+            </w:r>
+          </w:p>
+        </w:tc>
+        <w:tc>
+          <w:tcPr>
             <w:tcW w:type="dxa" w:w="1474"/>
           </w:tcPr>
           <w:p>
             <w:r/>
             <w:r>
               <w:rPr>
-                <w:sz w:val="15"/>
-              </w:rPr>
-              <w:t>[L13] Noel et al. (2016) CyGraph</w:t>
-            </w:r>
-          </w:p>
-        </w:tc>
-        <w:tc>
-          <w:tcPr>
-            <w:tcW w:type="dxa" w:w="1134"/>
-          </w:tcPr>
-          <w:p>
-            <w:r/>
-            <w:r>
-              <w:rPr>
-                <w:sz w:val="15"/>
-              </w:rPr>
-              <w:t>Cyber graph analytics</w:t>
-            </w:r>
-          </w:p>
-        </w:tc>
-        <w:tc>
-          <w:tcPr>
-            <w:tcW w:type="dxa" w:w="1928"/>
-          </w:tcPr>
-          <w:p>
-            <w:r/>
-            <w:r>
-              <w:rPr>
-                <w:sz w:val="15"/>
-              </w:rPr>
-              <w:t>Graph-based knowledge model and visualization of network/attack data</w:t>
-            </w:r>
-          </w:p>
-        </w:tc>
-        <w:tc>
-          <w:tcPr>
-            <w:tcW w:type="dxa" w:w="1814"/>
-          </w:tcPr>
-          <w:p>
-            <w:r/>
-            <w:r>
-              <w:rPr>
-                <w:sz w:val="15"/>
-              </w:rPr>
-              <w:t>Property graph (Neo4j) + query language; case studies</w:t>
-            </w:r>
-          </w:p>
-        </w:tc>
-        <w:tc>
-          <w:tcPr>
-            <w:tcW w:type="dxa" w:w="1814"/>
-          </w:tcPr>
-          <w:p>
-            <w:r/>
-            <w:r>
-              <w:rPr>
-                <w:sz w:val="15"/>
-              </w:rPr>
-              <w:t>Unified graph enables attack-path and mission-impact queries</w:t>
-            </w:r>
-          </w:p>
-        </w:tc>
-        <w:tc>
-          <w:tcPr>
-            <w:tcW w:type="dxa" w:w="1474"/>
-          </w:tcPr>
-          <w:p>
-            <w:r/>
-            <w:r>
-              <w:rPr>
-                <w:sz w:val="15"/>
-              </w:rPr>
-              <w:t>Internal network data; no open-source feeds; limited evaluation</w:t>
+                <w:sz w:val="14"/>
+              </w:rPr>
+              <w:t>Two vendors only; little on how TI is visualized</w:t>
             </w:r>
           </w:p>
         </w:tc>
@@ -2692,85 +2904,99 @@
       <w:tr>
         <w:tc>
           <w:tcPr>
+            <w:tcW w:type="dxa" w:w="1417"/>
+          </w:tcPr>
+          <w:p>
+            <w:r/>
+            <w:r>
+              <w:rPr>
+                <w:sz w:val="14"/>
+              </w:rPr>
+              <w:t>[L14] Kumarasinghe, Nabeel &amp; Elvitigala (2024)</w:t>
+            </w:r>
+          </w:p>
+        </w:tc>
+        <w:tc>
+          <w:tcPr>
+            <w:tcW w:type="dxa" w:w="964"/>
+          </w:tcPr>
+          <w:p>
+            <w:r/>
+            <w:r>
+              <w:rPr>
+                <w:sz w:val="14"/>
+              </w:rPr>
+              <w:t>Hosting infrastructure</w:t>
+            </w:r>
+          </w:p>
+        </w:tc>
+        <w:tc>
+          <w:tcPr>
+            <w:tcW w:type="dxa" w:w="1587"/>
+          </w:tcPr>
+          <w:p>
+            <w:r/>
+            <w:r>
+              <w:rPr>
+                <w:sz w:val="14"/>
+              </w:rPr>
+              <w:t>Forecasting malicious domains from the hosting infrastructure they share</w:t>
+            </w:r>
+          </w:p>
+        </w:tc>
+        <w:tc>
+          <w:tcPr>
+            <w:tcW w:type="dxa" w:w="1247"/>
+          </w:tcPr>
+          <w:p>
+            <w:r/>
+            <w:r>
+              <w:rPr>
+                <w:sz w:val="14"/>
+              </w:rPr>
+              <w:t>Infrastructure-based features and classification</w:t>
+            </w:r>
+          </w:p>
+        </w:tc>
+        <w:tc>
+          <w:tcPr>
+            <w:tcW w:type="dxa" w:w="1247"/>
+          </w:tcPr>
+          <w:p>
+            <w:r/>
+            <w:r>
+              <w:rPr>
+                <w:sz w:val="14"/>
+              </w:rPr>
+              <w:t>Domain, DNS and blocklist data</w:t>
+            </w:r>
+          </w:p>
+        </w:tc>
+        <w:tc>
+          <w:tcPr>
+            <w:tcW w:type="dxa" w:w="1701"/>
+          </w:tcPr>
+          <w:p>
+            <w:r/>
+            <w:r>
+              <w:rPr>
+                <w:sz w:val="14"/>
+              </w:rPr>
+              <w:t>Shared low-reputation hosting predicts future malicious domains</w:t>
+            </w:r>
+          </w:p>
+        </w:tc>
+        <w:tc>
+          <w:tcPr>
             <w:tcW w:type="dxa" w:w="1474"/>
           </w:tcPr>
           <w:p>
             <w:r/>
             <w:r>
               <w:rPr>
-                <w:sz w:val="15"/>
-              </w:rPr>
-              <w:t>[L14] Wagner et al. (2016) MISP</w:t>
-            </w:r>
-          </w:p>
-        </w:tc>
-        <w:tc>
-          <w:tcPr>
-            <w:tcW w:type="dxa" w:w="1134"/>
-          </w:tcPr>
-          <w:p>
-            <w:r/>
-            <w:r>
-              <w:rPr>
-                <w:sz w:val="15"/>
-              </w:rPr>
-              <w:t>Threat-intel platforms</w:t>
-            </w:r>
-          </w:p>
-        </w:tc>
-        <w:tc>
-          <w:tcPr>
-            <w:tcW w:type="dxa" w:w="1928"/>
-          </w:tcPr>
-          <w:p>
-            <w:r/>
-            <w:r>
-              <w:rPr>
-                <w:sz w:val="15"/>
-              </w:rPr>
-              <w:t>Design of a collaborative IOC sharing platform with correlation</w:t>
-            </w:r>
-          </w:p>
-        </w:tc>
-        <w:tc>
-          <w:tcPr>
-            <w:tcW w:type="dxa" w:w="1814"/>
-          </w:tcPr>
-          <w:p>
-            <w:r/>
-            <w:r>
-              <w:rPr>
-                <w:sz w:val="15"/>
-              </w:rPr>
-              <w:t>System design and operational deployment</w:t>
-            </w:r>
-          </w:p>
-        </w:tc>
-        <w:tc>
-          <w:tcPr>
-            <w:tcW w:type="dxa" w:w="1814"/>
-          </w:tcPr>
-          <w:p>
-            <w:r/>
-            <w:r>
-              <w:rPr>
-                <w:sz w:val="15"/>
-              </w:rPr>
-              <w:t>Automatic correlation of shared attributes speeds up analysis</w:t>
-            </w:r>
-          </w:p>
-        </w:tc>
-        <w:tc>
-          <w:tcPr>
-            <w:tcW w:type="dxa" w:w="1474"/>
-          </w:tcPr>
-          <w:p>
-            <w:r/>
-            <w:r>
-              <w:rPr>
-                <w:sz w:val="15"/>
-              </w:rPr>
-              <w:t>Correlation over shared attributes produces noisy links; basic visualisation</w:t>
+                <w:sz w:val="14"/>
+              </w:rPr>
+              <w:t>Shared infrastructure can also join benign tenants; classification, not visual analysis</w:t>
             </w:r>
           </w:p>
         </w:tc>
@@ -2778,71 +3004,185 @@
       <w:tr>
         <w:tc>
           <w:tcPr>
+            <w:tcW w:type="dxa" w:w="1417"/>
+          </w:tcPr>
+          <w:p>
+            <w:r/>
+            <w:r>
+              <w:rPr>
+                <w:sz w:val="14"/>
+              </w:rPr>
+              <w:t>[L15] Lo, Gupta, Shigyo, Wu, Bertini &amp; Qu (2022)</w:t>
+            </w:r>
+          </w:p>
+        </w:tc>
+        <w:tc>
+          <w:tcPr>
+            <w:tcW w:type="dxa" w:w="964"/>
+          </w:tcPr>
+          <w:p>
+            <w:r/>
+            <w:r>
+              <w:rPr>
+                <w:sz w:val="14"/>
+              </w:rPr>
+              <w:t>Misleading visualization</w:t>
+            </w:r>
+          </w:p>
+        </w:tc>
+        <w:tc>
+          <w:tcPr>
+            <w:tcW w:type="dxa" w:w="1587"/>
+          </w:tcPr>
+          <w:p>
+            <w:r/>
+            <w:r>
+              <w:rPr>
+                <w:sz w:val="14"/>
+              </w:rPr>
+              <w:t>Taxonomy of misleading visualizations</w:t>
+            </w:r>
+          </w:p>
+        </w:tc>
+        <w:tc>
+          <w:tcPr>
+            <w:tcW w:type="dxa" w:w="1247"/>
+          </w:tcPr>
+          <w:p>
+            <w:r/>
+            <w:r>
+              <w:rPr>
+                <w:sz w:val="14"/>
+              </w:rPr>
+              <w:t>Open coding of real-world reported charts</w:t>
+            </w:r>
+          </w:p>
+        </w:tc>
+        <w:tc>
+          <w:tcPr>
+            <w:tcW w:type="dxa" w:w="1247"/>
+          </w:tcPr>
+          <w:p>
+            <w:r/>
+            <w:r>
+              <w:rPr>
+                <w:sz w:val="14"/>
+              </w:rPr>
+              <w:t>&gt;1,000 visualizations reported as misleading</w:t>
+            </w:r>
+          </w:p>
+        </w:tc>
+        <w:tc>
+          <w:tcPr>
+            <w:tcW w:type="dxa" w:w="1701"/>
+          </w:tcPr>
+          <w:p>
+            <w:r/>
+            <w:r>
+              <w:rPr>
+                <w:sz w:val="14"/>
+              </w:rPr>
+              <w:t>74 types of issues; many arise from honest design choices, not deliberate deception</w:t>
+            </w:r>
+          </w:p>
+        </w:tc>
+        <w:tc>
+          <w:tcPr>
             <w:tcW w:type="dxa" w:w="1474"/>
           </w:tcPr>
           <w:p>
             <w:r/>
             <w:r>
               <w:rPr>
-                <w:sz w:val="15"/>
-              </w:rPr>
-              <w:t>[L15] Correll &amp; Heer (2017)</w:t>
-            </w:r>
-          </w:p>
-        </w:tc>
-        <w:tc>
-          <w:tcPr>
-            <w:tcW w:type="dxa" w:w="1134"/>
-          </w:tcPr>
-          <w:p>
-            <w:r/>
-            <w:r>
-              <w:rPr>
-                <w:sz w:val="15"/>
-              </w:rPr>
-              <w:t>Misleading visualization</w:t>
-            </w:r>
-          </w:p>
-        </w:tc>
-        <w:tc>
-          <w:tcPr>
-            <w:tcW w:type="dxa" w:w="1928"/>
-          </w:tcPr>
-          <w:p>
-            <w:r/>
-            <w:r>
-              <w:rPr>
-                <w:sz w:val="15"/>
-              </w:rPr>
-              <w:t>Catalogue of how charts deceive (black-hat visualization)</w:t>
-            </w:r>
-          </w:p>
-        </w:tc>
-        <w:tc>
-          <w:tcPr>
-            <w:tcW w:type="dxa" w:w="1814"/>
-          </w:tcPr>
-          <w:p>
-            <w:r/>
-            <w:r>
-              <w:rPr>
-                <w:sz w:val="15"/>
-              </w:rPr>
-              <w:t>Analysis of deceptive design patterns</w:t>
-            </w:r>
-          </w:p>
-        </w:tc>
-        <w:tc>
-          <w:tcPr>
-            <w:tcW w:type="dxa" w:w="1814"/>
-          </w:tcPr>
-          <w:p>
-            <w:r/>
-            <w:r>
-              <w:rPr>
-                <w:sz w:val="15"/>
-              </w:rPr>
-              <w:t>Aggregation, scaling and omitted context mislead even honest readers</w:t>
+                <w:sz w:val="14"/>
+              </w:rPr>
+              <w:t>General charts; no security-specific safeguards</w:t>
+            </w:r>
+          </w:p>
+        </w:tc>
+      </w:tr>
+      <w:tr>
+        <w:tc>
+          <w:tcPr>
+            <w:tcW w:type="dxa" w:w="1417"/>
+          </w:tcPr>
+          <w:p>
+            <w:r/>
+            <w:r>
+              <w:rPr>
+                <w:sz w:val="14"/>
+              </w:rPr>
+              <w:t>[L16] Di Bartolomeo et al. (2020)</w:t>
+            </w:r>
+          </w:p>
+        </w:tc>
+        <w:tc>
+          <w:tcPr>
+            <w:tcW w:type="dxa" w:w="964"/>
+          </w:tcPr>
+          <w:p>
+            <w:r/>
+            <w:r>
+              <w:rPr>
+                <w:sz w:val="14"/>
+              </w:rPr>
+              <w:t>Timeline visualization</w:t>
+            </w:r>
+          </w:p>
+        </w:tc>
+        <w:tc>
+          <w:tcPr>
+            <w:tcW w:type="dxa" w:w="1587"/>
+          </w:tcPr>
+          <w:p>
+            <w:r/>
+            <w:r>
+              <w:rPr>
+                <w:sz w:val="14"/>
+              </w:rPr>
+              <w:t>Effect of timeline shape on task performance</w:t>
+            </w:r>
+          </w:p>
+        </w:tc>
+        <w:tc>
+          <w:tcPr>
+            <w:tcW w:type="dxa" w:w="1247"/>
+          </w:tcPr>
+          <w:p>
+            <w:r/>
+            <w:r>
+              <w:rPr>
+                <w:sz w:val="14"/>
+              </w:rPr>
+              <w:t>Controlled online experiment</w:t>
+            </w:r>
+          </w:p>
+        </w:tc>
+        <w:tc>
+          <w:tcPr>
+            <w:tcW w:type="dxa" w:w="1247"/>
+          </w:tcPr>
+          <w:p>
+            <w:r/>
+            <w:r>
+              <w:rPr>
+                <w:sz w:val="14"/>
+              </w:rPr>
+              <w:t>192 participants; recurrent and non-recurrent event data</w:t>
+            </w:r>
+          </w:p>
+        </w:tc>
+        <w:tc>
+          <w:tcPr>
+            <w:tcW w:type="dxa" w:w="1701"/>
+          </w:tcPr>
+          <w:p>
+            <w:r/>
+            <w:r>
+              <w:rPr>
+                <w:sz w:val="14"/>
+              </w:rPr>
+              <w:t>Shape changes task time but not accuracy; linear timelines are fastest for lookup</w:t>
             </w:r>
           </w:p>
         </w:tc>
@@ -2854,9 +3194,9 @@
             <w:r/>
             <w:r>
               <w:rPr>
-                <w:sz w:val="15"/>
-              </w:rPr>
-              <w:t>Conceptual; no domain-specific safeguards</w:t>
+                <w:sz w:val="14"/>
+              </w:rPr>
+              <w:t>Synthetic tasks; no investigative context</w:t>
             </w:r>
           </w:p>
         </w:tc>
@@ -2884,7 +3224,19 @@
           <w:b w:val="0"/>
           <w:i w:val="0"/>
         </w:rPr>
-        <w:t>The surveyed work uses four families of visualization. Node-link graphs [L2, L5, L9, L13] dominate investigative and cyber work because they show connectivity directly. [L6] shows, however, that they lose readability as size and density grow, and [L5] recommends clustering and filtering. Link charts, meaning incremental ego-network expansion, are the analyst-facing form of the same model; Jigsaw [L2] and MISP [L14] both build on it. Timelines and calendar views [L2] support sequence and duration reasoning. Heat maps support density reasoning in space [L10] and in time. [L10] and [L11] both show that the chosen method and the underlying data quality change what the map appears to say. Social-network analysis [L8, L9] contributes centrality and subgroup measures that turn a picture into ranked evidence. Louvain community detection [L7] is the standard scalable way to find those subgroups.</w:t>
+        <w:t>Node-link graphs are the dominant form in cyber-intelligence work. [L11] classifies security visualizations by data, task and visual encoding, and graph-based CTI systems [L4, L5] and graph-mining methods [L6] model indicators, actors and infrastructure as linked entities. Link charts are the analyst-facing, incremental form of the same model: [L4] lets analysts explore STIX objects from a starting node. Graph analytics turns pictures into ranked evidence: centrality and community detection identify key actors [L6, L7]. Timelines support sequence and duration reasoning, and [L16] shows that a plain linear layout is fastest for lookup tasks, which is why this platform uses linear daily and Gantt timelines. Heat maps support density reasoning in space and time [L8]. However, [L8] shows that parameter choices change the hotspot map, and [L9] shows that the geolocation feeding such maps is itself unstable. Dashboards combine these views [L10], but most serve operational monitoring at the perception level rather than investigation [L10].</w:t>
+      </w:r>
+    </w:p>
+    <w:p>
+      <w:pPr>
+        <w:spacing w:after="120"/>
+      </w:pPr>
+      <w:r>
+        <w:rPr>
+          <w:b w:val="0"/>
+          <w:i w:val="0"/>
+        </w:rPr>
+        <w:t>On data, [L12] and [L13] show that threat feeds overlap very little. Combining several feeds is therefore necessary, and corroboration across feeds is informative. [L14] shows that shared hosting is a strong signal of malicious infrastructure, but also that it connects unrelated tenants. On interpretation, [L15] shows that most misleading charts come from ordinary design choices such as aggregation, scaling and omitted context, and the OSINT literature [L1, L2, L3] stresses transparency and purpose limitation.</w:t>
       </w:r>
     </w:p>
     <w:p>
@@ -2907,7 +3259,7 @@
         <w:t xml:space="preserve">G1 – Evidence provenance in the view. </w:t>
       </w:r>
       <w:r>
-        <w:t>Graph-based systems [L2, L9, L13, L14] draw links but rarely let the analyst see, on the link itself, which source record created it, by what method and with what confidence. Pirolli &amp; Card [L1] identify keeping track of evidence as a key leverage point. → Every edge in this platform carries source, record ID, time, method and confidence, shown in an evidence panel.</w:t>
+        <w:t>CTI graph and knowledge-graph systems [L4, L5] draw links but do not show, on the link itself, which source record created it, by what method and with what confidence. OSINT reviews [L1, L2] note that explainability is rarely addressed. → Every edge in this platform carries source, record ID, time, method and confidence, shown in an evidence panel.</w:t>
       </w:r>
     </w:p>
     <w:p>
@@ -2922,7 +3274,7 @@
         <w:t xml:space="preserve">G2 – False links through shared infrastructure. </w:t>
       </w:r>
       <w:r>
-        <w:t>Attribute-based correlation [L14] and large-graph analytics [L13] connect everything that shares an attribute. In open feeds, CDNs, code-hosting and paste platforms are shared by thousands of unrelated actors. The effect is noted informally but rarely measured. → Hub suppression, quantified before and after (Section 8.3).</w:t>
+        <w:t>Infrastructure-based correlation [L14] and graph mining [L6] link everything that shares a host, IP or provider. In open feeds, code-hosting and CDN platforms are shared by thousands of unrelated actors, and the effect on visual analysis is rarely measured. → Hub suppression, quantified before and after (Section 8.3).</w:t>
       </w:r>
     </w:p>
     <w:p>
@@ -2937,7 +3289,7 @@
         <w:t xml:space="preserve">G3 – Normalisation and uncertainty in geographic views. </w:t>
       </w:r>
       <w:r>
-        <w:t>Hotspot work [L10] shows that method changes the conclusion, and [L11] shows geolocation error. Cyber-threat maps nevertheless typically plot raw counts. → Distinct-IP weighting, per-million-IPv4 normalisation, and cross-validation of geolocation against registry data.</w:t>
+        <w:t>Hotspot methods are parameter-sensitive [L8] and geolocation databases are unstable [L9]. Threat maps nevertheless typically plot raw counts from one provider. → Distinct-IP weighting, per-million-IPv4 normalisation, and cross-validation of geolocation against registry data.</w:t>
       </w:r>
     </w:p>
     <w:p>
@@ -2952,7 +3304,7 @@
         <w:t xml:space="preserve">G4 – Temporal semantics. </w:t>
       </w:r>
       <w:r>
-        <w:t>Timelines in investigative tools [L2] do not distinguish event time from report time. Feeds record when something was reported, not when it was active. → Explicit report-time labelling; observation-only timestamps excluded.</w:t>
+        <w:t>Timeline research [L16] studies layout but not the meaning of the timestamps. Feeds record when something was reported, not when it was active, and feed timeliness differs [L13]. → Explicit report-time labelling, window filtering, and exclusion of observation-only timestamps.</w:t>
       </w:r>
     </w:p>
     <w:p>
@@ -2964,10 +3316,10 @@
         <w:rPr>
           <w:b/>
         </w:rPr>
-        <w:t xml:space="preserve">G5 – Integrated, reproducible OSINT visualization over public data. </w:t>
+        <w:t xml:space="preserve">G5 – Investigation-oriented, evaluated dashboards over multiple open feeds. </w:t>
       </w:r>
       <w:r>
-        <w:t>Surveys [L3, L12] note that most systems address one data type or view, and that evaluation is rare [L12]. → One provenance-labelled model feeds four coordinated views, built from a hash-verified public snapshot that anyone can re-run.</w:t>
+        <w:t>Dashboards mostly target operational monitoring [L10]; feed studies [L12, L13] do not visualise relationships. → One provenance-labelled model over three feeds drives four coordinated views. The views are evaluated with quantitative misinterpretation experiments, from a hash-verified snapshot anyone can re-run.</w:t>
       </w:r>
     </w:p>
     <w:p>
@@ -2982,7 +3334,7 @@
         <w:t xml:space="preserve">G6 – Ethics built into the tool. </w:t>
       </w:r>
       <w:r>
-        <w:t>[L4] sets out the legal and ethical principles, but technical controls are rarely described. → Pseudonymised reporters, defanged reports, passive-only collection.</w:t>
+        <w:t>[L3] shows that acceptance of OSINT depends on transparency and privacy, but technical controls in tools are rarely described. → Pseudonymised reporters, defanged reports, passive-only collection.</w:t>
       </w:r>
     </w:p>
     <w:p>
@@ -6271,7 +6623,7 @@
               <w:rPr>
                 <w:sz w:val="16"/>
               </w:rPr>
-              <w:t>Large dense data (hairball) [L6]; reading time</w:t>
+              <w:t>Large dense data (hairball); reading time</w:t>
             </w:r>
           </w:p>
         </w:tc>
@@ -6597,6 +6949,128 @@
       <w:pPr>
         <w:spacing w:after="40"/>
       </w:pPr>
+    </w:p>
+    <w:p>
+      <w:pPr>
+        <w:pStyle w:val="Heading2"/>
+      </w:pPr>
+      <w:r>
+        <w:t>5.1 Worked investigation: how the views support each other</w:t>
+      </w:r>
+    </w:p>
+    <w:p>
+      <w:pPr>
+        <w:spacing w:after="120"/>
+      </w:pPr>
+      <w:r>
+        <w:rPr>
+          <w:b w:val="0"/>
+          <w:i w:val="0"/>
+        </w:rPr>
+        <w:t>To justify the selection in practice, the following investigation was run end to end on the snapshot using only the dashboard. Each step uses the view suited to the question at that point, and each safeguard is visible where it matters.</w:t>
+      </w:r>
+    </w:p>
+    <w:p>
+      <w:pPr>
+        <w:pStyle w:val="ListBullet"/>
+        <w:spacing w:after="40"/>
+      </w:pPr>
+      <w:r>
+        <w:rPr>
+          <w:b/>
+        </w:rPr>
+        <w:t xml:space="preserve">Step 1 – Entry point (IOC extraction). </w:t>
+      </w:r>
+      <w:r>
+        <w:t>An analyst pastes a defanged note containing 176.65.134[.]121. The extractor refangs it and finds it in the dataset as an entity reported by URLhaus (Figure 10).</w:t>
+      </w:r>
+    </w:p>
+    <w:p>
+      <w:pPr>
+        <w:pStyle w:val="ListBullet"/>
+        <w:spacing w:after="40"/>
+      </w:pPr>
+      <w:r>
+        <w:rPr>
+          <w:b/>
+        </w:rPr>
+        <w:t xml:space="preserve">Step 2 – Link chart (IQ2). </w:t>
+      </w:r>
+      <w:r>
+        <w:t>Expanding the IP shows 367 URL records hosted on it, on ports 8080, 7356, 7412, 7380. Only 15 per relation are drawn, and the chart states how many are hidden. The dashed edges show AS51396 (Pfcloud UG (haftungsbeschrankt)) and DE; dashed means they come from enrichment, not from the feed (Figure 4). The evidence panel shows that ip-api and Team Cymru agree on the ASN (AS51396) and that the registry country is DE.</w:t>
+      </w:r>
+    </w:p>
+    <w:p>
+      <w:pPr>
+        <w:pStyle w:val="ListBullet"/>
+        <w:spacing w:after="40"/>
+      </w:pPr>
+      <w:r>
+        <w:rPr>
+          <w:b/>
+        </w:rPr>
+        <w:t xml:space="preserve">Step 3 – Graph (IQ1, IQ6). </w:t>
+      </w:r>
+      <w:r>
+        <w:t>The IP belongs to cluster C0001, the largest infrastructure cluster after hub suppression: 367 indicators, family purity 0.978, dominated by Mirai. The IP is the highest-degree node in the suppressed graph (Table 12), so it is the pivot to act on first.</w:t>
+      </w:r>
+    </w:p>
+    <w:p>
+      <w:pPr>
+        <w:pStyle w:val="ListBullet"/>
+        <w:spacing w:after="40"/>
+      </w:pPr>
+      <w:r>
+        <w:rPr>
+          <w:b/>
+        </w:rPr>
+        <w:t xml:space="preserve">Step 4 – Timeline (IQ3). </w:t>
+      </w:r>
+      <w:r>
+        <w:t>The cluster was reported between 2026-09-19 and 2026-09-30. The timeline labels this as report time, so the analyst records 'reported active from …', not 'attack started on …'.</w:t>
+      </w:r>
+    </w:p>
+    <w:p>
+      <w:pPr>
+        <w:pStyle w:val="ListBullet"/>
+        <w:spacing w:after="40"/>
+      </w:pPr>
+      <w:r>
+        <w:rPr>
+          <w:b/>
+        </w:rPr>
+        <w:t xml:space="preserve">Step 5 – Heat map (IQ4). </w:t>
+      </w:r>
+      <w:r>
+        <w:t>Germany appears among the top hosting countries by distinct IPs. Switching to the normalised metric shows that Germany is not over-represented for its address space. This single server is therefore a hosting-abuse case, not evidence of a German hotspot.</w:t>
+      </w:r>
+    </w:p>
+    <w:p>
+      <w:pPr>
+        <w:pStyle w:val="ListBullet"/>
+        <w:spacing w:after="40"/>
+      </w:pPr>
+      <w:r>
+        <w:rPr>
+          <w:b/>
+        </w:rPr>
+        <w:t xml:space="preserve">Step 6 – Report. </w:t>
+      </w:r>
+      <w:r>
+        <w:t>The cluster report (Figure 11) lists every entity defanged, with its evidence trail and a stated confidence (single feed → medium), ready to send to the hosting provider's abuse contact.</w:t>
+      </w:r>
+    </w:p>
+    <w:p>
+      <w:pPr>
+        <w:spacing w:after="120"/>
+      </w:pPr>
+      <w:r>
+        <w:rPr>
+          <w:b w:val="0"/>
+          <w:i w:val="0"/>
+        </w:rPr>
+        <w:t>Without the safeguards, the same walk would have gone wrong at three points. Expanding a GitHub-hosted indicator would have pulled in 13,580 unrelated entities. The country map would have suggested a German hotspot. The report dates could have been quoted as attack dates. With them, every statement in the final report can be traced to a source record.</w:t>
+      </w:r>
     </w:p>
     <w:p>
       <w:pPr>
@@ -10456,7 +10930,7 @@
               <w:rPr>
                 <w:sz w:val="17"/>
               </w:rPr>
-              <w:t>Country-level location is mostly reliable; disagreements are shown as a caveat on the map [L11]</w:t>
+              <w:t>Country-level location is mostly reliable; disagreements are shown as a caveat on the map [L9]</w:t>
             </w:r>
           </w:p>
         </w:tc>
@@ -11402,7 +11876,7 @@
         <w:t>Privacy and minimisation:</w:t>
       </w:r>
       <w:r>
-        <w:t xml:space="preserve"> the platform analyses infrastructure, not people. Reporter handles are replaced by stable pseudonyms (R-xxxxxx) in every output and used only in aggregate. No WHOIS registrant data or other personal data is collected, in line with purpose limitation and data minimisation [L4], [R5].</w:t>
+        <w:t xml:space="preserve"> the platform analyses infrastructure, not people. Reporter handles are replaced by stable pseudonyms (R-xxxxxx) in every output and used only in aggregate. No WHOIS registrant data or other personal data is collected, in line with purpose limitation and data minimisation [L3], [R5].</w:t>
       </w:r>
     </w:p>
     <w:p>
@@ -11665,7 +12139,7 @@
           <w:i w:val="0"/>
           <w:sz w:val="19"/>
         </w:rPr>
-        <w:t>[L1] P. Pirolli and S. Card, "The sensemaking process and leverage points for analyst technology as identified through cognitive task analysis," in Proc. Int. Conf. on Intelligence Analysis, McLean, VA, 2005.</w:t>
+        <w:t>[L1] A. Yadav, A. Kumar and V. Singh, "Open-source intelligence: a comprehensive review of the current state, applications and future perspectives in cyber security," Artificial Intelligence Review, vol. 56, pp. 12407–12438, 2023. doi:10.1007/s10462-023-10454-y</w:t>
       </w:r>
     </w:p>
     <w:p>
@@ -11678,7 +12152,7 @@
           <w:i w:val="0"/>
           <w:sz w:val="19"/>
         </w:rPr>
-        <w:t>[L2] J. Stasko, C. Görg and Z. Liu, "Jigsaw: Supporting investigative analysis through interactive visualization," Information Visualization, vol. 7, no. 2, pp. 118–132, 2008.</w:t>
+        <w:t>[L2] T. O. Browne, M. Abedin and M. J. M. Chowdhury, "A systematic review on research utilising artificial intelligence for open source intelligence (OSINT) applications," International Journal of Information Security, vol. 23, pp. 2911–2938, 2024. doi:10.1007/s10207-024-00868-2</w:t>
       </w:r>
     </w:p>
     <w:p>
@@ -11691,7 +12165,7 @@
           <w:i w:val="0"/>
           <w:sz w:val="19"/>
         </w:rPr>
-        <w:t>[L3] J. Pastor-Galindo, P. Nespoli, F. Gómez Mármol and G. Martínez Pérez, "The not yet exploited goldmine of OSINT: Opportunities, open challenges and future trends," IEEE Access, vol. 8, pp. 10282–10304, 2020.</w:t>
+        <w:t>[L3] T. Riebe, T. Biselli, M.-A. Kaufhold and C. Reuter, "Privacy concerns and acceptance factors of OSINT for cybersecurity: A representative survey," Proceedings on Privacy Enhancing Technologies, vol. 2023, no. 1, pp. 477–493, 2023. doi:10.56553/popets-2023-0028</w:t>
       </w:r>
     </w:p>
     <w:p>
@@ -11704,7 +12178,7 @@
           <w:i w:val="0"/>
           <w:sz w:val="19"/>
         </w:rPr>
-        <w:t>[L4] I. Böhm and S. Lolagar, "Open source intelligence: Introduction, legal, and ethical considerations," International Cybersecurity Law Review, vol. 2, pp. 317–337, 2021.</w:t>
+        <w:t>[L4] F. Böhm, F. Menges and G. Pernul, "Graph-based visual analytics for cyber threat intelligence," Cybersecurity, vol. 1, art. 16, 2018. doi:10.1186/s42400-018-0017-4</w:t>
       </w:r>
     </w:p>
     <w:p>
@@ -11717,7 +12191,7 @@
           <w:i w:val="0"/>
           <w:sz w:val="19"/>
         </w:rPr>
-        <w:t>[L5] I. Herman, G. Melançon and M. S. Marshall, "Graph visualization and navigation in information visualization: A survey," IEEE Trans. Visualization and Computer Graphics, vol. 6, no. 1, pp. 24–43, 2000.</w:t>
+        <w:t>[L5] I. Sarhan and M. Spruit, "Open-CyKG: An open cyber threat intelligence knowledge graph," Knowledge-Based Systems, vol. 233, art. 107524, 2021. doi:10.1016/j.knosys.2021.107524</w:t>
       </w:r>
     </w:p>
     <w:p>
@@ -11730,7 +12204,7 @@
           <w:i w:val="0"/>
           <w:sz w:val="19"/>
         </w:rPr>
-        <w:t>[L6] M. Ghoniem, J.-D. Fekete and P. Castagliola, "A comparison of the readability of graphs using node-link and matrix-based representations," in Proc. IEEE Symp. on Information Visualization (InfoVis), 2004, pp. 17–24.</w:t>
+        <w:t>[L6] B. Yan, C. Yang, C. Shi, Y. Fang, Q. Li, Y. Ye and J. Du, "Graph mining for cybersecurity: A survey," ACM Transactions on Knowledge Discovery from Data, vol. 18, no. 2, pp. 1–52, 2023. doi:10.1145/3610228</w:t>
       </w:r>
     </w:p>
     <w:p>
@@ -11743,7 +12217,7 @@
           <w:i w:val="0"/>
           <w:sz w:val="19"/>
         </w:rPr>
-        <w:t>[L7] V. D. Blondel, J.-L. Guillaume, R. Lambiotte and E. Lefebvre, "Fast unfolding of communities in large networks," J. Statistical Mechanics: Theory and Experiment, P10008, 2008.</w:t>
+        <w:t>[L7] I. Pete, J. Hughes, Y. T. Chua and M. Bada, "A social network analysis and comparison of six dark web forums," in Proc. IEEE European Symposium on Security and Privacy Workshops (EuroS&amp;PW), 2020, pp. 484–493. doi:10.1109/EuroSPW51379.2020.00071</w:t>
       </w:r>
     </w:p>
     <w:p>
@@ -11756,7 +12230,7 @@
           <w:i w:val="0"/>
           <w:sz w:val="19"/>
         </w:rPr>
-        <w:t>[L8] V. E. Krebs, "Mapping networks of terrorist cells," Connections, vol. 24, no. 3, pp. 43–52, 2002.</w:t>
+        <w:t>[L8] Y. Hu, F. Wang, C. Guin and H. Zhu, "A spatio-temporal kernel density estimation framework for predictive crime hotspot mapping and evaluation," Applied Geography, vol. 99, pp. 89–97, 2018. doi:10.1016/j.apgeog.2018.08.001</w:t>
       </w:r>
     </w:p>
     <w:p>
@@ -11769,7 +12243,7 @@
           <w:i w:val="0"/>
           <w:sz w:val="19"/>
         </w:rPr>
-        <w:t>[L9] J. Xu and H. Chen, "Criminal network analysis and visualization," Communications of the ACM, vol. 48, no. 6, pp. 100–107, 2005.</w:t>
+        <w:t>[L9] M. Gouel, K. Vermeulen, R. Beverly, O. Fourmaux and T. Friedman, "IP geolocation database stability and implications for network research," in Proc. Network Traffic Measurement and Analysis Conference (TMA), IFIP, 2021.</w:t>
       </w:r>
     </w:p>
     <w:p>
@@ -11782,7 +12256,7 @@
           <w:i w:val="0"/>
           <w:sz w:val="19"/>
         </w:rPr>
-        <w:t>[L10] S. Chainey, L. Tompson and S. Uhlig, "The utility of hotspot mapping for predicting spatial patterns of crime," Security Journal, vol. 21, no. 1–2, pp. 4–28, 2008.</w:t>
+        <w:t>[L10] L. Jiang, A. Jayatilaka, M. Nasim, M. Grobler, M. Zahedi and M. A. Babar, "Systematic literature review on cyber situational awareness visualizations," IEEE Access, vol. 10, pp. 57525–57554, 2022. doi:10.1109/ACCESS.2022.3178195</w:t>
       </w:r>
     </w:p>
     <w:p>
@@ -11795,7 +12269,7 @@
           <w:i w:val="0"/>
           <w:sz w:val="19"/>
         </w:rPr>
-        <w:t>[L11] I. Poese, S. Uhlig, M. A. Kaafar, B. Donnet and B. Gueye, "IP geolocation databases: Unreliable?" ACM SIGCOMM Computer Communication Review, vol. 41, no. 2, pp. 53–56, 2011.</w:t>
+        <w:t>[L11] A. Komadina, Ž. Mihajlović and S. Groš, "Analysis of the design space for cybersecurity visualizations in VizSec," in Proc. IEEE Symposium on Visualization for Cyber Security (VizSec), 2022, pp. 1–11. doi:10.1109/VizSec56996.2022.9941422</w:t>
       </w:r>
     </w:p>
     <w:p>
@@ -11808,7 +12282,7 @@
           <w:i w:val="0"/>
           <w:sz w:val="19"/>
         </w:rPr>
-        <w:t>[L12] H. Shiravi, A. Shiravi and A. A. Ghorbani, "A survey of visualization systems for network security," IEEE Trans. Visualization and Computer Graphics, vol. 18, no. 8, pp. 1313–1329, 2012.</w:t>
+        <w:t>[L12] V. G. Li, M. Dunn, P. Pearce, D. McCoy, G. M. Voelker, S. Savage and K. Levchenko, "Reading the tea leaves: A comparative analysis of threat intelligence," in Proc. 28th USENIX Security Symposium, 2019.</w:t>
       </w:r>
     </w:p>
     <w:p>
@@ -11821,7 +12295,7 @@
           <w:i w:val="0"/>
           <w:sz w:val="19"/>
         </w:rPr>
-        <w:t>[L13] S. Noel, E. Harley, K. H. Tam, M. Limiero and M. Share, "CyGraph: Graph-based analytics and visualization for cybersecurity," in Handbook of Statistics, vol. 35, Elsevier, 2016, pp. 117–167.</w:t>
+        <w:t>[L13] X. Bouwman, H. Griffioen, J. Egbers, C. Doerr, B. Klievink and M. van Eeten, "A different cup of TI? The added value of commercial threat intelligence," in Proc. 29th USENIX Security Symposium, 2020, pp. 433–450.</w:t>
       </w:r>
     </w:p>
     <w:p>
@@ -11834,7 +12308,7 @@
           <w:i w:val="0"/>
           <w:sz w:val="19"/>
         </w:rPr>
-        <w:t>[L14] C. Wagner, A. Dulaunoy, G. Wagener and A. Iklody, "MISP: The design and implementation of a collaborative threat intelligence sharing platform," in Proc. ACM Workshop on Information Sharing and Collaborative Security (WISCS), 2016, pp. 49–56.</w:t>
+        <w:t>[L14] U. Kumarasinghe, M. Nabeel and C. Elvitigala, "Blocklist-Forecast: Proactive domain blocklisting by identifying malicious hosting infrastructure," in Proc. 27th Int. Symposium on Research in Attacks, Intrusions and Defenses (RAID), ACM, 2024, pp. 35–48. doi:10.1145/3678890.3678925</w:t>
       </w:r>
     </w:p>
     <w:p>
@@ -11847,7 +12321,20 @@
           <w:i w:val="0"/>
           <w:sz w:val="19"/>
         </w:rPr>
-        <w:t>[L15] M. Correll and J. Heer, "Black hat visualization," in Proc. IEEE VIS Workshop on Dealing with Cognitive Biases in Visualisations (DECISIVe), 2017.</w:t>
+        <w:t>[L15] L. Y.-H. Lo, A. Gupta, K. Shigyo, A. Wu, E. Bertini and H. Qu, "Misinformed by visualization: What do we learn from misinformative visualizations?" Computer Graphics Forum, vol. 41, no. 3, pp. 515–525, 2022. doi:10.1111/cgf.14559</w:t>
+      </w:r>
+    </w:p>
+    <w:p>
+      <w:pPr>
+        <w:spacing w:after="60"/>
+      </w:pPr>
+      <w:r>
+        <w:rPr>
+          <w:b w:val="0"/>
+          <w:i w:val="0"/>
+          <w:sz w:val="19"/>
+        </w:rPr>
+        <w:t>[L16] S. Di Bartolomeo, A. Pandey, A. Leventidis, D. Saffo, U. H. Syeda, E. Carstensdottir, M. Seif El-Nasr, M. A. Borkin and C. Dunne, "Evaluating the effect of timeline shape on visualization task performance," in Proc. ACM CHI Conference on Human Factors in Computing Systems, 2020, pp. 1–12. doi:10.1145/3313831.3376237</w:t>
       </w:r>
     </w:p>
     <w:p>
@@ -11977,6 +12464,19 @@
           <w:sz w:val="19"/>
         </w:rPr>
         <w:t>[R9] A. Hagberg, D. Schult and P. Swart, "Exploring network structure, dynamics, and function using NetworkX," in Proc. 7th Python in Science Conf. (SciPy), 2008, pp. 11–15.</w:t>
+      </w:r>
+    </w:p>
+    <w:p>
+      <w:pPr>
+        <w:spacing w:after="60"/>
+      </w:pPr>
+      <w:r>
+        <w:rPr>
+          <w:b w:val="0"/>
+          <w:i w:val="0"/>
+          <w:sz w:val="19"/>
+        </w:rPr>
+        <w:t>[R11] V. D. Blondel, J.-L. Guillaume, R. Lambiotte and E. Lefebvre, "Fast unfolding of communities in large networks," J. Statistical Mechanics: Theory and Experiment, P10008, 2008 (Louvain algorithm used in Section 6.3).</w:t>
       </w:r>
     </w:p>
     <w:p>

</xml_diff>

<commit_message>
Add WHOIS (RDAP) domain-registration enrichment and analysis
- RDAP lookups (RFC 9083) routed to each registry via the IANA bootstrap (RFC 9224);
  only registration date, expiry and registrar are stored, no registrant data
- Rate-limited lookups are cached with their status and retried on the next run
- Domain age at first report per feed, share of newly registered domains and top
  registrars added to the analytics; registration data shown in the evidence panel
- Enrichment snapshot updated so the WHOIS results reproduce offline
- Report: WHOIS source, Section 6.7, key finding, ethics note and RFC references
</commit_message>
<xml_diff>
--- a/docs/OSINT_Visualization_Platform_Report.docx
+++ b/docs/OSINT_Visualization_Platform_Report.docx
@@ -341,7 +341,7 @@
           <w:i w:val="0"/>
           <w:sz w:val="22"/>
         </w:rPr>
-        <w:t xml:space="preserve">      6.1 Cleaning · 6.2 Correlation and hub suppression · 6.3 Graph · 6.4 Temporal · 6.5 Geographic · 6.6 Social network</w:t>
+        <w:t xml:space="preserve">      6.1 Cleaning · 6.2 Correlation and hub suppression · 6.3 Graph · 6.4 Temporal · 6.5 Geographic · 6.6 Social network · 6.7 WHOIS / RDAP</w:t>
       </w:r>
     </w:p>
     <w:p>
@@ -470,7 +470,7 @@
           <w:b w:val="0"/>
           <w:i w:val="0"/>
         </w:rPr>
-        <w:t>Open threat-intelligence feeds publish thousands of malicious indicators every day, but as flat lists. The intelligence an analyst needs is in the relationships the lists do not show: shared servers, campaign time spans, and concentrations of infrastructure. This project designs and implements a visualization-based OSINT analytics platform. It collected 3 public feeds (URLhaus, ThreatFox, OpenPhish) and enriched them with DNS, IP geolocation, an independent ASN registry service and RIR address statistics. From these it built a provenance-labelled knowledge graph of 50,391 entities and 145,463 relationships. It then compared four visualization families (graphs, link charts, timelines and heat maps), assigning each the investigative questions it answers best. Each view carries safeguards against misinterpretation. The safeguards were tested quantitatively. Without hub suppression, multi-tenant platforms such as raw.githubusercontent.com merge unrelated indicators into a false 'campaign' of 13,580 entities; with suppression the largest cluster is 368. Normalising hosting countries by allocated IPv4 space keeps only 3 of the raw top-10 countries (Spearman ρ = 0.362). Geolocation was cross-validated against registry data (76.0% country agreement, 98.7% ASN agreement). A literature survey of 16 recent papers identifies the research gaps the architecture addresses.</w:t>
+        <w:t>Open threat-intelligence feeds publish thousands of malicious indicators every day, but as flat lists. The intelligence an analyst needs is in the relationships the lists do not show: shared servers, campaign time spans, and concentrations of infrastructure. This project designs and implements a visualization-based OSINT analytics platform. It collected 3 public feeds (URLhaus, ThreatFox, OpenPhish) and enriched them with DNS, WHOIS (RDAP) registration data, IP geolocation, an independent ASN registry service and RIR address statistics. From these it built a provenance-labelled knowledge graph of 50,391 entities and 145,463 relationships. It then compared four visualization families (graphs, link charts, timelines and heat maps), assigning each the investigative questions it answers best. Each view carries safeguards against misinterpretation. The safeguards were tested quantitatively. Without hub suppression, multi-tenant platforms such as raw.githubusercontent.com merge unrelated indicators into a false 'campaign' of 13,580 entities; with suppression the largest cluster is 368. Normalising hosting countries by allocated IPv4 space keeps only 3 of the raw top-10 countries (Spearman ρ = 0.362). Geolocation was cross-validated against registry data (76.0% country agreement, 98.7% ASN agreement). A literature survey of 16 recent papers identifies the research gaps the architecture addresses.</w:t>
       </w:r>
     </w:p>
     <w:p>
@@ -627,7 +627,7 @@
               <w:rPr>
                 <w:sz w:val="18"/>
               </w:rPr>
-              <w:t>3 feeds + 4 enrichment sources; SHA-256 manifest</w:t>
+              <w:t>3 feeds + 5 enrichment sources; SHA-256 manifest</w:t>
             </w:r>
           </w:p>
         </w:tc>
@@ -1375,7 +1375,7 @@
         <w:t>In scope:</w:t>
       </w:r>
       <w:r>
-        <w:t xml:space="preserve"> passive collection from URLhaus, ThreatFox and OpenPhish; passive enrichment through DNS, ip-api.com, the Team Cymru IP-to-ASN service and NRO RIR delegation statistics; free-text IOC extraction; correlation, analytics, visualization, reporting and export.</w:t>
+        <w:t xml:space="preserve"> passive collection from URLhaus, ThreatFox and OpenPhish; passive enrichment through DNS, WHOIS/RDAP, ip-api.com, the Team Cymru IP-to-ASN service and NRO RIR delegation statistics; free-text IOC extraction; correlation, analytics, visualization, reporting and export.</w:t>
       </w:r>
     </w:p>
     <w:p>
@@ -3354,7 +3354,7 @@
           <w:b w:val="0"/>
           <w:i w:val="0"/>
         </w:rPr>
-        <w:t>The dataset had to contain entities, relationships, timestamps, locations and threat indicators. No single open source provides all five, so three primary feeds were combined with four enrichment sources. Table 4 lists every source, what it contributes, how it is accessed and how failure is handled.</w:t>
+        <w:t>The dataset had to contain entities, relationships, timestamps, locations and threat indicators. No single open source provides all five, so three primary feeds were combined with five enrichment sources. Table 4 lists every source, what it contributes, how it is accessed and how failure is handled.</w:t>
       </w:r>
     </w:p>
     <w:p>
@@ -3822,6 +3822,78 @@
                 <w:sz w:val="16"/>
               </w:rPr>
               <w:t>Rate-limit headers honoured; failed batch logged</w:t>
+            </w:r>
+          </w:p>
+        </w:tc>
+      </w:tr>
+      <w:tr>
+        <w:tc>
+          <w:tcPr>
+            <w:tcW w:type="dxa" w:w="1587"/>
+          </w:tcPr>
+          <w:p>
+            <w:r/>
+            <w:r>
+              <w:rPr>
+                <w:sz w:val="16"/>
+              </w:rPr>
+              <w:t>WHOIS via RDAP (IANA bootstrap → registry RDAP servers)</w:t>
+            </w:r>
+          </w:p>
+        </w:tc>
+        <w:tc>
+          <w:tcPr>
+            <w:tcW w:type="dxa" w:w="1361"/>
+          </w:tcPr>
+          <w:p>
+            <w:r/>
+            <w:r>
+              <w:rPr>
+                <w:sz w:val="16"/>
+              </w:rPr>
+              <w:t>Enrichment (domain registration)</w:t>
+            </w:r>
+          </w:p>
+        </w:tc>
+        <w:tc>
+          <w:tcPr>
+            <w:tcW w:type="dxa" w:w="2268"/>
+          </w:tcPr>
+          <w:p>
+            <w:r/>
+            <w:r>
+              <w:rPr>
+                <w:sz w:val="16"/>
+              </w:rPr>
+              <w:t>Registration date, expiry, registrar of each registered domain</w:t>
+            </w:r>
+          </w:p>
+        </w:tc>
+        <w:tc>
+          <w:tcPr>
+            <w:tcW w:type="dxa" w:w="2041"/>
+          </w:tcPr>
+          <w:p>
+            <w:r/>
+            <w:r>
+              <w:rPr>
+                <w:sz w:val="16"/>
+              </w:rPr>
+              <w:t>RDAP JSON queries (RFC 9083), 8 threads</w:t>
+            </w:r>
+          </w:p>
+        </w:tc>
+        <w:tc>
+          <w:tcPr>
+            <w:tcW w:type="dxa" w:w="2041"/>
+          </w:tcPr>
+          <w:p>
+            <w:r/>
+            <w:r>
+              <w:rPr>
+                <w:sz w:val="16"/>
+              </w:rPr>
+              <w:t>429/404 stored as status; retried on next run</w:t>
             </w:r>
           </w:p>
         </w:tc>
@@ -9719,6 +9791,372 @@
     </w:p>
     <w:p>
       <w:pPr>
+        <w:pStyle w:val="Heading2"/>
+      </w:pPr>
+      <w:r>
+        <w:t>6.7 WHOIS / RDAP domain-registration analysis</w:t>
+      </w:r>
+    </w:p>
+    <w:p>
+      <w:pPr>
+        <w:spacing w:after="120"/>
+      </w:pPr>
+      <w:r>
+        <w:rPr>
+          <w:b w:val="0"/>
+          <w:i w:val="0"/>
+        </w:rPr>
+        <w:t>WHOIS registration data was collected through RDAP, the standardised JSON successor of WHOIS (RFC 9083). Each registered domain is sent to its registry's RDAP server, found through the IANA bootstrap file (RFC 9224). Only the registration date and registrar are stored, never registrant contact details. For 1,252 non-platform domains with a registration date, the domain's age when it was first reported was computed (first-seen date minus registration date).</w:t>
+      </w:r>
+    </w:p>
+    <w:p>
+      <w:pPr>
+        <w:spacing w:after="40"/>
+      </w:pPr>
+      <w:r>
+        <w:rPr>
+          <w:b w:val="0"/>
+          <w:i/>
+          <w:sz w:val="18"/>
+        </w:rPr>
+        <w:t>Table 15. Domain age at first report (WHOIS / RDAP)</w:t>
+      </w:r>
+    </w:p>
+    <w:tbl>
+      <w:tblPr>
+        <w:tblStyle w:val="TableGrid"/>
+        <w:tblW w:type="auto" w:w="0"/>
+        <w:jc w:val="center"/>
+        <w:tblLook w:firstColumn="1" w:firstRow="1" w:lastColumn="0" w:lastRow="0" w:noHBand="0" w:noVBand="1" w:val="04A0"/>
+      </w:tblPr>
+      <w:tblGrid>
+        <w:gridCol w:w="4873"/>
+        <w:gridCol w:w="4873"/>
+      </w:tblGrid>
+      <w:tr>
+        <w:tc>
+          <w:tcPr>
+            <w:tcW w:type="dxa" w:w="3685"/>
+            <w:shd w:val="clear" w:color="auto" w:fill="D9E2F3"/>
+          </w:tcPr>
+          <w:p>
+            <w:r/>
+            <w:r>
+              <w:rPr>
+                <w:b/>
+                <w:sz w:val="18"/>
+              </w:rPr>
+              <w:t>Measure</w:t>
+            </w:r>
+          </w:p>
+        </w:tc>
+        <w:tc>
+          <w:tcPr>
+            <w:tcW w:type="dxa" w:w="5386"/>
+            <w:shd w:val="clear" w:color="auto" w:fill="D9E2F3"/>
+          </w:tcPr>
+          <w:p>
+            <w:r/>
+            <w:r>
+              <w:rPr>
+                <w:b/>
+                <w:sz w:val="18"/>
+              </w:rPr>
+              <w:t>Value</w:t>
+            </w:r>
+          </w:p>
+        </w:tc>
+      </w:tr>
+      <w:tr>
+        <w:tc>
+          <w:tcPr>
+            <w:tcW w:type="dxa" w:w="3685"/>
+          </w:tcPr>
+          <w:p>
+            <w:r/>
+            <w:r>
+              <w:rPr>
+                <w:sz w:val="18"/>
+              </w:rPr>
+              <w:t>Domains with RDAP registration date</w:t>
+            </w:r>
+          </w:p>
+        </w:tc>
+        <w:tc>
+          <w:tcPr>
+            <w:tcW w:type="dxa" w:w="5386"/>
+          </w:tcPr>
+          <w:p>
+            <w:r/>
+            <w:r>
+              <w:rPr>
+                <w:sz w:val="18"/>
+              </w:rPr>
+              <w:t>1,252</w:t>
+            </w:r>
+          </w:p>
+        </w:tc>
+      </w:tr>
+      <w:tr>
+        <w:tc>
+          <w:tcPr>
+            <w:tcW w:type="dxa" w:w="3685"/>
+          </w:tcPr>
+          <w:p>
+            <w:r/>
+            <w:r>
+              <w:rPr>
+                <w:sz w:val="18"/>
+              </w:rPr>
+              <w:t>Median age at first report</w:t>
+            </w:r>
+          </w:p>
+        </w:tc>
+        <w:tc>
+          <w:tcPr>
+            <w:tcW w:type="dxa" w:w="5386"/>
+          </w:tcPr>
+          <w:p>
+            <w:r/>
+            <w:r>
+              <w:rPr>
+                <w:sz w:val="18"/>
+              </w:rPr>
+              <w:t>189 days</w:t>
+            </w:r>
+          </w:p>
+        </w:tc>
+      </w:tr>
+      <w:tr>
+        <w:tc>
+          <w:tcPr>
+            <w:tcW w:type="dxa" w:w="3685"/>
+          </w:tcPr>
+          <w:p>
+            <w:r/>
+            <w:r>
+              <w:rPr>
+                <w:sz w:val="18"/>
+              </w:rPr>
+              <w:t>Registered &lt; 7 days before being reported</w:t>
+            </w:r>
+          </w:p>
+        </w:tc>
+        <w:tc>
+          <w:tcPr>
+            <w:tcW w:type="dxa" w:w="5386"/>
+          </w:tcPr>
+          <w:p>
+            <w:r/>
+            <w:r>
+              <w:rPr>
+                <w:sz w:val="18"/>
+              </w:rPr>
+              <w:t>22.3%</w:t>
+            </w:r>
+          </w:p>
+        </w:tc>
+      </w:tr>
+      <w:tr>
+        <w:tc>
+          <w:tcPr>
+            <w:tcW w:type="dxa" w:w="3685"/>
+          </w:tcPr>
+          <w:p>
+            <w:r/>
+            <w:r>
+              <w:rPr>
+                <w:sz w:val="18"/>
+              </w:rPr>
+              <w:t>Registered &lt; 30 days before being reported</w:t>
+            </w:r>
+          </w:p>
+        </w:tc>
+        <w:tc>
+          <w:tcPr>
+            <w:tcW w:type="dxa" w:w="5386"/>
+          </w:tcPr>
+          <w:p>
+            <w:r/>
+            <w:r>
+              <w:rPr>
+                <w:sz w:val="18"/>
+              </w:rPr>
+              <w:t>32.9%</w:t>
+            </w:r>
+          </w:p>
+        </w:tc>
+      </w:tr>
+      <w:tr>
+        <w:tc>
+          <w:tcPr>
+            <w:tcW w:type="dxa" w:w="3685"/>
+          </w:tcPr>
+          <w:p>
+            <w:r/>
+            <w:r>
+              <w:rPr>
+                <w:sz w:val="18"/>
+              </w:rPr>
+              <w:t>Older than 1 year when reported</w:t>
+            </w:r>
+          </w:p>
+        </w:tc>
+        <w:tc>
+          <w:tcPr>
+            <w:tcW w:type="dxa" w:w="5386"/>
+          </w:tcPr>
+          <w:p>
+            <w:r/>
+            <w:r>
+              <w:rPr>
+                <w:sz w:val="18"/>
+              </w:rPr>
+              <w:t>40.8%</w:t>
+            </w:r>
+          </w:p>
+        </w:tc>
+      </w:tr>
+      <w:tr>
+        <w:tc>
+          <w:tcPr>
+            <w:tcW w:type="dxa" w:w="3685"/>
+          </w:tcPr>
+          <w:p>
+            <w:r/>
+            <w:r>
+              <w:rPr>
+                <w:sz w:val="18"/>
+              </w:rPr>
+              <w:t>Median age – openphish</w:t>
+            </w:r>
+          </w:p>
+        </w:tc>
+        <w:tc>
+          <w:tcPr>
+            <w:tcW w:type="dxa" w:w="5386"/>
+          </w:tcPr>
+          <w:p>
+            <w:r/>
+            <w:r>
+              <w:rPr>
+                <w:sz w:val="18"/>
+              </w:rPr>
+              <w:t>263 days (63 domains; 28.6% &lt; 30 days)</w:t>
+            </w:r>
+          </w:p>
+        </w:tc>
+      </w:tr>
+      <w:tr>
+        <w:tc>
+          <w:tcPr>
+            <w:tcW w:type="dxa" w:w="3685"/>
+          </w:tcPr>
+          <w:p>
+            <w:r/>
+            <w:r>
+              <w:rPr>
+                <w:sz w:val="18"/>
+              </w:rPr>
+              <w:t>Median age – threatfox</w:t>
+            </w:r>
+          </w:p>
+        </w:tc>
+        <w:tc>
+          <w:tcPr>
+            <w:tcW w:type="dxa" w:w="5386"/>
+          </w:tcPr>
+          <w:p>
+            <w:r/>
+            <w:r>
+              <w:rPr>
+                <w:sz w:val="18"/>
+              </w:rPr>
+              <w:t>255 days (847 domains; 32.1% &lt; 30 days)</w:t>
+            </w:r>
+          </w:p>
+        </w:tc>
+      </w:tr>
+      <w:tr>
+        <w:tc>
+          <w:tcPr>
+            <w:tcW w:type="dxa" w:w="3685"/>
+          </w:tcPr>
+          <w:p>
+            <w:r/>
+            <w:r>
+              <w:rPr>
+                <w:sz w:val="18"/>
+              </w:rPr>
+              <w:t>Median age – urlhaus</w:t>
+            </w:r>
+          </w:p>
+        </w:tc>
+        <w:tc>
+          <w:tcPr>
+            <w:tcW w:type="dxa" w:w="5386"/>
+          </w:tcPr>
+          <w:p>
+            <w:r/>
+            <w:r>
+              <w:rPr>
+                <w:sz w:val="18"/>
+              </w:rPr>
+              <w:t>95 days (342 domains; 35.7% &lt; 30 days)</w:t>
+            </w:r>
+          </w:p>
+        </w:tc>
+      </w:tr>
+      <w:tr>
+        <w:tc>
+          <w:tcPr>
+            <w:tcW w:type="dxa" w:w="3685"/>
+          </w:tcPr>
+          <w:p>
+            <w:r/>
+            <w:r>
+              <w:rPr>
+                <w:sz w:val="18"/>
+              </w:rPr>
+              <w:t>Most frequent registrars</w:t>
+            </w:r>
+          </w:p>
+        </w:tc>
+        <w:tc>
+          <w:tcPr>
+            <w:tcW w:type="dxa" w:w="5386"/>
+          </w:tcPr>
+          <w:p>
+            <w:r/>
+            <w:r>
+              <w:rPr>
+                <w:sz w:val="18"/>
+              </w:rPr>
+              <w:t>NameCheap, Inc. (160), GoDaddy.com, LLC (125), Dynadot Inc (93), NICENIC INTERNATIONAL GROUP CO., LIMITED (88), GMO Internet Group, Inc. d/b/a Onamae.com (72), Spaceship, Inc. (69)</w:t>
+            </w:r>
+          </w:p>
+        </w:tc>
+      </w:tr>
+    </w:tbl>
+    <w:p>
+      <w:pPr>
+        <w:spacing w:after="40"/>
+      </w:pPr>
+    </w:p>
+    <w:p>
+      <w:pPr>
+        <w:spacing w:after="120"/>
+      </w:pPr>
+      <w:r>
+        <w:rPr>
+          <w:b w:val="0"/>
+          <w:i w:val="0"/>
+        </w:rPr>
+        <w:t>Two populations are visible. About a third of the domains were registered within a month of being reported, and most of those within a week. These are attacker-registered throw-away domains. Roughly 40% were more than a year old, which is typical of compromised legitimate websites. The distinction matters for response: a new domain should be reported to its registrar for suspension, while an old one usually belongs to a victim whose site has been compromised. Domain age is shown in the evidence panel of every domain, so the analyst sees it before acting.</w:t>
+      </w:r>
+    </w:p>
+    <w:p>
+      <w:pPr>
         <w:pStyle w:val="Heading1"/>
       </w:pPr>
       <w:r>
@@ -9747,7 +10185,7 @@
           <w:i/>
           <w:sz w:val="18"/>
         </w:rPr>
-        <w:t>Table 15. Technology stack</w:t>
+        <w:t>Table 16. Technology stack</w:t>
       </w:r>
     </w:p>
     <w:tbl>
@@ -10656,6 +11094,21 @@
         <w:rPr>
           <w:b/>
         </w:rPr>
+        <w:t>Two kinds of domains:</w:t>
+      </w:r>
+      <w:r>
+        <w:t xml:space="preserve"> WHOIS/RDAP shows 22.3% of dated malicious domains were registered less than a week before being reported and 40.8% were over a year old. This separates throw-away attacker domains from compromised legitimate sites, which need different responses.</w:t>
+      </w:r>
+    </w:p>
+    <w:p>
+      <w:pPr>
+        <w:pStyle w:val="ListBullet"/>
+        <w:spacing w:after="40"/>
+      </w:pPr>
+      <w:r>
+        <w:rPr>
+          <w:b/>
+        </w:rPr>
         <w:t>Low feed overlap:</w:t>
       </w:r>
       <w:r>
@@ -10692,7 +11145,7 @@
           <w:i/>
           <w:sz w:val="18"/>
         </w:rPr>
-        <w:t>Table 16. Cross-source validation results</w:t>
+        <w:t>Table 17. Cross-source validation results</w:t>
       </w:r>
     </w:p>
     <w:tbl>
@@ -11197,7 +11650,7 @@
           <w:i/>
           <w:sz w:val="18"/>
         </w:rPr>
-        <w:t>Table 17. Cluster structure with and without hub suppression</w:t>
+        <w:t>Table 18. Cluster structure with and without hub suppression</w:t>
       </w:r>
     </w:p>
     <w:tbl>
@@ -11876,7 +12329,7 @@
         <w:t>Privacy and minimisation:</w:t>
       </w:r>
       <w:r>
-        <w:t xml:space="preserve"> the platform analyses infrastructure, not people. Reporter handles are replaced by stable pseudonyms (R-xxxxxx) in every output and used only in aggregate. No WHOIS registrant data or other personal data is collected, in line with purpose limitation and data minimisation [L3], [R5].</w:t>
+        <w:t xml:space="preserve"> the platform analyses infrastructure, not people. Reporter handles are replaced by stable pseudonyms (R-xxxxxx) in every output and used only in aggregate. WHOIS (RDAP) lookups store only the registration date and registrar, never registrant names, e-mail addresses or phone numbers, and no other personal data is collected, in line with purpose limitation and data minimisation [L3], [R5].</w:t>
       </w:r>
     </w:p>
     <w:p>
@@ -12386,6 +12839,19 @@
           <w:sz w:val="19"/>
         </w:rPr>
         <w:t>[R3] ip-api.com, "Batch JSON API documentation." https://ip-api.com/docs/api:batch ; Team Cymru, "IP to ASN Mapping Service." https://www.team-cymru.com/ip-asn-mapping</w:t>
+      </w:r>
+    </w:p>
+    <w:p>
+      <w:pPr>
+        <w:spacing w:after="60"/>
+      </w:pPr>
+      <w:r>
+        <w:rPr>
+          <w:b w:val="0"/>
+          <w:i w:val="0"/>
+          <w:sz w:val="19"/>
+        </w:rPr>
+        <w:t>[R12] S. Hollenbeck and A. Newton, "JSON Responses for the Registration Data Access Protocol (RDAP)," RFC 9083, IETF, 2021; M. Blanchet, "Finding the Authoritative Registration Data Access Protocol (RDAP) Service," RFC 9224, IETF, 2022.</w:t>
       </w:r>
     </w:p>
     <w:p>

</xml_diff>